<commit_message>
updatetd the chapter 1-2
</commit_message>
<xml_diff>
--- a/Documents/NexusFlow_Chapters_3_4.docx
+++ b/Documents/NexusFlow_Chapters_3_4.docx
@@ -51,7 +51,39 @@
           <w:sz w:val="24"/>
           <w:szCs w:val="24"/>
         </w:rPr>
-        <w:t>A Data Flow Diagram models how data moves through NexusFlow — between the user, the system's internal processes, and its data stores — without describing the internal implementation of each process. Three levels of increasing detail are presented below: a Context (Level 0) diagram showing NexusFlow as a single process, a Level 1 diagram decomposing it into its six major processes, and a Level 2 diagram further decomposing the Task Management process, since task handling is the most operationally complex module in the system.</w:t>
+        <w:t xml:space="preserve">A Data Flow Diagram models how data moves through </w:t>
+      </w:r>
+      <w:proofErr w:type="spellStart"/>
+      <w:r>
+        <w:rPr>
+          <w:sz w:val="24"/>
+          <w:szCs w:val="24"/>
+        </w:rPr>
+        <w:t>NexusFlow</w:t>
+      </w:r>
+      <w:proofErr w:type="spellEnd"/>
+      <w:r>
+        <w:rPr>
+          <w:sz w:val="24"/>
+          <w:szCs w:val="24"/>
+        </w:rPr>
+        <w:t xml:space="preserve"> — between the user, the system's internal processes, and its data stores — without describing the internal implementation of each process. Three levels of increasing detail are presented below: a Context (Level 0) diagram showing </w:t>
+      </w:r>
+      <w:proofErr w:type="spellStart"/>
+      <w:r>
+        <w:rPr>
+          <w:sz w:val="24"/>
+          <w:szCs w:val="24"/>
+        </w:rPr>
+        <w:t>NexusFlow</w:t>
+      </w:r>
+      <w:proofErr w:type="spellEnd"/>
+      <w:r>
+        <w:rPr>
+          <w:sz w:val="24"/>
+          <w:szCs w:val="24"/>
+        </w:rPr>
+        <w:t xml:space="preserve"> as a single process, a Level 1 diagram decomposing it into its six major processes, and a Level 2 diagram further decomposing the Task Management process, since task handling is the most operationally complex module in the system.</w:t>
       </w:r>
     </w:p>
     <w:p>
@@ -78,7 +110,23 @@
           <w:sz w:val="24"/>
           <w:szCs w:val="24"/>
         </w:rPr>
-        <w:t>The context diagram treats NexusFlow as a single process and shows only the data exchanged with its external entity, the User (representing any of the four roles: Admin, Project Manager, Team Member, or Client).</w:t>
+        <w:t xml:space="preserve">The context diagram treats </w:t>
+      </w:r>
+      <w:proofErr w:type="spellStart"/>
+      <w:r>
+        <w:rPr>
+          <w:sz w:val="24"/>
+          <w:szCs w:val="24"/>
+        </w:rPr>
+        <w:t>NexusFlow</w:t>
+      </w:r>
+      <w:proofErr w:type="spellEnd"/>
+      <w:r>
+        <w:rPr>
+          <w:sz w:val="24"/>
+          <w:szCs w:val="24"/>
+        </w:rPr>
+        <w:t xml:space="preserve"> as a single process and shows only the data exchanged with its external entity, the User (representing any of the four roles: Admin, Project Manager, Team Member, or Client).</w:t>
       </w:r>
     </w:p>
     <w:p>
@@ -221,7 +269,23 @@
           <w:sz w:val="24"/>
           <w:szCs w:val="24"/>
         </w:rPr>
-        <w:t>3.0 Manage Tasks — performs CRUD and assignment operations against D3 (Tasks) and D6 (TaskAssignees), and triggers Process 5.0 on assignment.</w:t>
+        <w:t>3.0 Manage Tasks — performs CRUD and assignment operations against D3 (Tasks) and D6 (</w:t>
+      </w:r>
+      <w:proofErr w:type="spellStart"/>
+      <w:r>
+        <w:rPr>
+          <w:sz w:val="24"/>
+          <w:szCs w:val="24"/>
+        </w:rPr>
+        <w:t>TaskAssignees</w:t>
+      </w:r>
+      <w:proofErr w:type="spellEnd"/>
+      <w:r>
+        <w:rPr>
+          <w:sz w:val="24"/>
+          <w:szCs w:val="24"/>
+        </w:rPr>
+        <w:t>), and triggers Process 5.0 on assignment.</w:t>
       </w:r>
     </w:p>
     <w:p>
@@ -373,17 +437,20 @@
         <w:pStyle w:val="ListParagraph"/>
         <w:numPr>
           <w:ilvl w:val="0"/>
-          <w:numId w:val="2"/>
+          <w:numId w:val="4"/>
         </w:numPr>
-        <w:spacing w:after="80" w:line="360" w:lineRule="auto"/>
-        <w:jc w:val="both"/>
-      </w:pPr>
-      <w:r>
-        <w:rPr>
-          <w:sz w:val="24"/>
-          <w:szCs w:val="24"/>
-        </w:rPr>
-        <w:t>3.1 Create Task — inserts a new row into D3 (Tasks) with Status fixed to Todo regardless of client input, then passes the new TaskId to 3.2.</w:t>
+        <w:spacing w:before="120" w:after="80"/>
+        <w:rPr>
+          <w:sz w:val="24"/>
+          <w:szCs w:val="24"/>
+        </w:rPr>
+      </w:pPr>
+      <w:r>
+        <w:rPr>
+          <w:sz w:val="24"/>
+          <w:szCs w:val="24"/>
+        </w:rPr>
+        <w:t>3.1 Create Task – creates a new task with initial Todo status and optional Assignment Note.</w:t>
       </w:r>
     </w:p>
     <w:p>
@@ -391,17 +458,20 @@
         <w:pStyle w:val="ListParagraph"/>
         <w:numPr>
           <w:ilvl w:val="0"/>
-          <w:numId w:val="2"/>
+          <w:numId w:val="4"/>
         </w:numPr>
-        <w:spacing w:after="80" w:line="360" w:lineRule="auto"/>
-        <w:jc w:val="both"/>
-      </w:pPr>
-      <w:r>
-        <w:rPr>
-          <w:sz w:val="24"/>
-          <w:szCs w:val="24"/>
-        </w:rPr>
-        <w:t>3.2 Assign Task to Users — inserts rows into D6 (TaskAssignees) for each selected user and creates a corresponding alert in D5 (Notifications).</w:t>
+        <w:spacing w:before="120" w:after="80"/>
+        <w:rPr>
+          <w:sz w:val="24"/>
+          <w:szCs w:val="24"/>
+        </w:rPr>
+      </w:pPr>
+      <w:r>
+        <w:rPr>
+          <w:sz w:val="24"/>
+          <w:szCs w:val="24"/>
+        </w:rPr>
+        <w:t>3.2 Assign Task – assigns one or more users and automatically generates notifications.</w:t>
       </w:r>
     </w:p>
     <w:p>
@@ -409,17 +479,20 @@
         <w:pStyle w:val="ListParagraph"/>
         <w:numPr>
           <w:ilvl w:val="0"/>
-          <w:numId w:val="2"/>
+          <w:numId w:val="4"/>
         </w:numPr>
-        <w:spacing w:after="80" w:line="360" w:lineRule="auto"/>
-        <w:jc w:val="both"/>
-      </w:pPr>
-      <w:r>
-        <w:rPr>
-          <w:sz w:val="24"/>
-          <w:szCs w:val="24"/>
-        </w:rPr>
-        <w:t>3.3 Update Task Status — updates the Status/Priority/DueDate fields of an existing row in D3.</w:t>
+        <w:spacing w:before="120" w:after="80"/>
+        <w:rPr>
+          <w:sz w:val="24"/>
+          <w:szCs w:val="24"/>
+        </w:rPr>
+      </w:pPr>
+      <w:r>
+        <w:rPr>
+          <w:sz w:val="24"/>
+          <w:szCs w:val="24"/>
+        </w:rPr>
+        <w:t>3.3 Accept Task – allows the assignee to acknowledge the task before starting work.</w:t>
       </w:r>
     </w:p>
     <w:p>
@@ -427,23 +500,126 @@
         <w:pStyle w:val="ListParagraph"/>
         <w:numPr>
           <w:ilvl w:val="0"/>
-          <w:numId w:val="2"/>
+          <w:numId w:val="4"/>
         </w:numPr>
-        <w:spacing w:after="80" w:line="360" w:lineRule="auto"/>
-        <w:jc w:val="both"/>
-      </w:pPr>
-      <w:r>
-        <w:rPr>
-          <w:sz w:val="24"/>
-          <w:szCs w:val="24"/>
-        </w:rPr>
-        <w:t>3.4 Delete Task (Soft Delete) — sets IsDeleted = true on the D3 row rather than physically removing it, preserving the audit trail.</w:t>
+        <w:spacing w:before="120" w:after="80"/>
+        <w:rPr>
+          <w:sz w:val="24"/>
+          <w:szCs w:val="24"/>
+        </w:rPr>
+      </w:pPr>
+      <w:r>
+        <w:rPr>
+          <w:sz w:val="24"/>
+          <w:szCs w:val="24"/>
+        </w:rPr>
+        <w:t>3.4 Request Clarification – enables assignees to ask questions regarding the assigned task.</w:t>
       </w:r>
     </w:p>
     <w:p>
       <w:pPr>
+        <w:pStyle w:val="ListParagraph"/>
+        <w:numPr>
+          <w:ilvl w:val="0"/>
+          <w:numId w:val="4"/>
+        </w:numPr>
         <w:spacing w:before="120" w:after="80"/>
-        <w:jc w:val="center"/>
+        <w:rPr>
+          <w:sz w:val="24"/>
+          <w:szCs w:val="24"/>
+        </w:rPr>
+      </w:pPr>
+      <w:r>
+        <w:rPr>
+          <w:sz w:val="24"/>
+          <w:szCs w:val="24"/>
+        </w:rPr>
+        <w:t>3.5 Respond to Clarification – allows the task creator or manager to answer clarification requests.</w:t>
+      </w:r>
+    </w:p>
+    <w:p>
+      <w:pPr>
+        <w:pStyle w:val="ListParagraph"/>
+        <w:numPr>
+          <w:ilvl w:val="0"/>
+          <w:numId w:val="4"/>
+        </w:numPr>
+        <w:spacing w:before="120" w:after="80"/>
+        <w:rPr>
+          <w:sz w:val="24"/>
+          <w:szCs w:val="24"/>
+        </w:rPr>
+      </w:pPr>
+      <w:r>
+        <w:rPr>
+          <w:sz w:val="24"/>
+          <w:szCs w:val="24"/>
+        </w:rPr>
+        <w:t>3.6 Update Task Status – updates workflow status and optionally records a Work Log entry.</w:t>
+      </w:r>
+    </w:p>
+    <w:p>
+      <w:pPr>
+        <w:pStyle w:val="ListParagraph"/>
+        <w:numPr>
+          <w:ilvl w:val="0"/>
+          <w:numId w:val="4"/>
+        </w:numPr>
+        <w:spacing w:before="120" w:after="80"/>
+        <w:rPr>
+          <w:sz w:val="24"/>
+          <w:szCs w:val="24"/>
+        </w:rPr>
+      </w:pPr>
+      <w:r>
+        <w:rPr>
+          <w:sz w:val="24"/>
+          <w:szCs w:val="24"/>
+        </w:rPr>
+        <w:t xml:space="preserve">3.7 Record Activity Timeline – stores significant workflow events in the </w:t>
+      </w:r>
+      <w:proofErr w:type="spellStart"/>
+      <w:r>
+        <w:rPr>
+          <w:sz w:val="24"/>
+          <w:szCs w:val="24"/>
+        </w:rPr>
+        <w:t>AuditLog</w:t>
+      </w:r>
+      <w:proofErr w:type="spellEnd"/>
+      <w:r>
+        <w:rPr>
+          <w:sz w:val="24"/>
+          <w:szCs w:val="24"/>
+        </w:rPr>
+        <w:t>.</w:t>
+      </w:r>
+    </w:p>
+    <w:p>
+      <w:pPr>
+        <w:pStyle w:val="ListParagraph"/>
+        <w:numPr>
+          <w:ilvl w:val="0"/>
+          <w:numId w:val="4"/>
+        </w:numPr>
+        <w:spacing w:before="120" w:after="80"/>
+      </w:pPr>
+      <w:r>
+        <w:rPr>
+          <w:sz w:val="24"/>
+          <w:szCs w:val="24"/>
+        </w:rPr>
+        <w:t>3.8 Soft Delete Task – performs logical deletion while preserving history.</w:t>
+      </w:r>
+    </w:p>
+    <w:p>
+      <w:pPr>
+        <w:pStyle w:val="ListParagraph"/>
+        <w:numPr>
+          <w:ilvl w:val="0"/>
+          <w:numId w:val="3"/>
+        </w:numPr>
+        <w:spacing w:before="120" w:after="80"/>
       </w:pPr>
       <w:r>
         <w:rPr>
@@ -533,7 +709,119 @@
           <w:sz w:val="24"/>
           <w:szCs w:val="24"/>
         </w:rPr>
-        <w:t>The Entity-Relationship diagram below models the ten most structurally significant entities of NexusFlow's fourteen-table schema (Organization, User, Project, ProjectMember, ProjectTask, TaskAssignee, SubTask, Comment, Notification, and RefreshToken) and the relationships between them. Department, Team, TeamMember, and AuditLog exist in the schema to support future organizational hierarchy and audit-trail features but are omitted here for clarity, as they do not participate in the core project/task workflow.</w:t>
+        <w:t xml:space="preserve">The Entity-Relationship diagram below models the ten most structurally significant entities of NexusFlow's fourteen-table schema (Organization, User, Project, </w:t>
+      </w:r>
+      <w:proofErr w:type="spellStart"/>
+      <w:r>
+        <w:rPr>
+          <w:sz w:val="24"/>
+          <w:szCs w:val="24"/>
+        </w:rPr>
+        <w:t>ProjectMember</w:t>
+      </w:r>
+      <w:proofErr w:type="spellEnd"/>
+      <w:r>
+        <w:rPr>
+          <w:sz w:val="24"/>
+          <w:szCs w:val="24"/>
+        </w:rPr>
+        <w:t xml:space="preserve">, </w:t>
+      </w:r>
+      <w:proofErr w:type="spellStart"/>
+      <w:r>
+        <w:rPr>
+          <w:sz w:val="24"/>
+          <w:szCs w:val="24"/>
+        </w:rPr>
+        <w:t>ProjectTask</w:t>
+      </w:r>
+      <w:proofErr w:type="spellEnd"/>
+      <w:r>
+        <w:rPr>
+          <w:sz w:val="24"/>
+          <w:szCs w:val="24"/>
+        </w:rPr>
+        <w:t xml:space="preserve">, </w:t>
+      </w:r>
+      <w:proofErr w:type="spellStart"/>
+      <w:r>
+        <w:rPr>
+          <w:sz w:val="24"/>
+          <w:szCs w:val="24"/>
+        </w:rPr>
+        <w:t>TaskAssignee</w:t>
+      </w:r>
+      <w:proofErr w:type="spellEnd"/>
+      <w:r>
+        <w:rPr>
+          <w:sz w:val="24"/>
+          <w:szCs w:val="24"/>
+        </w:rPr>
+        <w:t xml:space="preserve">, </w:t>
+      </w:r>
+      <w:proofErr w:type="spellStart"/>
+      <w:r>
+        <w:rPr>
+          <w:sz w:val="24"/>
+          <w:szCs w:val="24"/>
+        </w:rPr>
+        <w:t>SubTask</w:t>
+      </w:r>
+      <w:proofErr w:type="spellEnd"/>
+      <w:r>
+        <w:rPr>
+          <w:sz w:val="24"/>
+          <w:szCs w:val="24"/>
+        </w:rPr>
+        <w:t xml:space="preserve">, Comment, Notification, and </w:t>
+      </w:r>
+      <w:proofErr w:type="spellStart"/>
+      <w:r>
+        <w:rPr>
+          <w:sz w:val="24"/>
+          <w:szCs w:val="24"/>
+        </w:rPr>
+        <w:t>RefreshToken</w:t>
+      </w:r>
+      <w:proofErr w:type="spellEnd"/>
+      <w:r>
+        <w:rPr>
+          <w:sz w:val="24"/>
+          <w:szCs w:val="24"/>
+        </w:rPr>
+        <w:t xml:space="preserve">) and the relationships between them. Department, Team, </w:t>
+      </w:r>
+      <w:proofErr w:type="spellStart"/>
+      <w:r>
+        <w:rPr>
+          <w:sz w:val="24"/>
+          <w:szCs w:val="24"/>
+        </w:rPr>
+        <w:t>TeamMember</w:t>
+      </w:r>
+      <w:proofErr w:type="spellEnd"/>
+      <w:r>
+        <w:rPr>
+          <w:sz w:val="24"/>
+          <w:szCs w:val="24"/>
+        </w:rPr>
+        <w:t xml:space="preserve">, and </w:t>
+      </w:r>
+      <w:proofErr w:type="spellStart"/>
+      <w:r>
+        <w:rPr>
+          <w:sz w:val="24"/>
+          <w:szCs w:val="24"/>
+        </w:rPr>
+        <w:t>AuditLog</w:t>
+      </w:r>
+      <w:proofErr w:type="spellEnd"/>
+      <w:r>
+        <w:rPr>
+          <w:sz w:val="24"/>
+          <w:szCs w:val="24"/>
+        </w:rPr>
+        <w:t xml:space="preserve"> exist in the schema to support future organizational hierarchy and audit-trail features but are omitted here for clarity, as they do not participate in the core project/task workflow.</w:t>
       </w:r>
     </w:p>
     <w:p>
@@ -662,7 +950,71 @@
           <w:szCs w:val="24"/>
         </w:rPr>
         <w:lastRenderedPageBreak/>
-        <w:t>A Project has many ProjectMembers and many ProjectTasks (1:M); a User can, through ProjectMember, belong to many projects — a many-to-many relationship between User and Project realized via the ProjectMember junction table.</w:t>
+        <w:t xml:space="preserve">A Project has many </w:t>
+      </w:r>
+      <w:proofErr w:type="spellStart"/>
+      <w:r>
+        <w:rPr>
+          <w:sz w:val="24"/>
+          <w:szCs w:val="24"/>
+        </w:rPr>
+        <w:t>ProjectMembers</w:t>
+      </w:r>
+      <w:proofErr w:type="spellEnd"/>
+      <w:r>
+        <w:rPr>
+          <w:sz w:val="24"/>
+          <w:szCs w:val="24"/>
+        </w:rPr>
+        <w:t xml:space="preserve"> and many </w:t>
+      </w:r>
+      <w:proofErr w:type="spellStart"/>
+      <w:r>
+        <w:rPr>
+          <w:sz w:val="24"/>
+          <w:szCs w:val="24"/>
+        </w:rPr>
+        <w:t>ProjectTasks</w:t>
+      </w:r>
+      <w:proofErr w:type="spellEnd"/>
+      <w:r>
+        <w:rPr>
+          <w:sz w:val="24"/>
+          <w:szCs w:val="24"/>
+        </w:rPr>
+        <w:t xml:space="preserve"> (1:M); a User can, through </w:t>
+      </w:r>
+      <w:proofErr w:type="spellStart"/>
+      <w:r>
+        <w:rPr>
+          <w:sz w:val="24"/>
+          <w:szCs w:val="24"/>
+        </w:rPr>
+        <w:t>ProjectMember</w:t>
+      </w:r>
+      <w:proofErr w:type="spellEnd"/>
+      <w:r>
+        <w:rPr>
+          <w:sz w:val="24"/>
+          <w:szCs w:val="24"/>
+        </w:rPr>
+        <w:t xml:space="preserve">, belong to many projects — a many-to-many relationship between User and Project realized via the </w:t>
+      </w:r>
+      <w:proofErr w:type="spellStart"/>
+      <w:r>
+        <w:rPr>
+          <w:sz w:val="24"/>
+          <w:szCs w:val="24"/>
+        </w:rPr>
+        <w:t>ProjectMember</w:t>
+      </w:r>
+      <w:proofErr w:type="spellEnd"/>
+      <w:r>
+        <w:rPr>
+          <w:sz w:val="24"/>
+          <w:szCs w:val="24"/>
+        </w:rPr>
+        <w:t xml:space="preserve"> junction table.</w:t>
       </w:r>
     </w:p>
     <w:p>
@@ -680,7 +1032,55 @@
           <w:sz w:val="24"/>
           <w:szCs w:val="24"/>
         </w:rPr>
-        <w:t>A ProjectTask has many TaskAssignees (1:M), which similarly realizes a many-to-many relationship between ProjectTask and User — a task can have multiple assignees, and a user can be assigned to multiple tasks.</w:t>
+        <w:t xml:space="preserve">A </w:t>
+      </w:r>
+      <w:proofErr w:type="spellStart"/>
+      <w:r>
+        <w:rPr>
+          <w:sz w:val="24"/>
+          <w:szCs w:val="24"/>
+        </w:rPr>
+        <w:t>ProjectTask</w:t>
+      </w:r>
+      <w:proofErr w:type="spellEnd"/>
+      <w:r>
+        <w:rPr>
+          <w:sz w:val="24"/>
+          <w:szCs w:val="24"/>
+        </w:rPr>
+        <w:t xml:space="preserve"> has many </w:t>
+      </w:r>
+      <w:proofErr w:type="spellStart"/>
+      <w:r>
+        <w:rPr>
+          <w:sz w:val="24"/>
+          <w:szCs w:val="24"/>
+        </w:rPr>
+        <w:t>TaskAssignees</w:t>
+      </w:r>
+      <w:proofErr w:type="spellEnd"/>
+      <w:r>
+        <w:rPr>
+          <w:sz w:val="24"/>
+          <w:szCs w:val="24"/>
+        </w:rPr>
+        <w:t xml:space="preserve"> (1:M), which similarly realizes a many-to-many relationship between </w:t>
+      </w:r>
+      <w:proofErr w:type="spellStart"/>
+      <w:r>
+        <w:rPr>
+          <w:sz w:val="24"/>
+          <w:szCs w:val="24"/>
+        </w:rPr>
+        <w:t>ProjectTask</w:t>
+      </w:r>
+      <w:proofErr w:type="spellEnd"/>
+      <w:r>
+        <w:rPr>
+          <w:sz w:val="24"/>
+          <w:szCs w:val="24"/>
+        </w:rPr>
+        <w:t xml:space="preserve"> and User — a task can have multiple assignees, and a user can be assigned to multiple tasks.</w:t>
       </w:r>
     </w:p>
     <w:p>
@@ -698,7 +1098,39 @@
           <w:sz w:val="24"/>
           <w:szCs w:val="24"/>
         </w:rPr>
-        <w:t>A ProjectTask has many SubTasks and many Comments (1:M); each Comment also belongs to exactly one User (the commenter).</w:t>
+        <w:t xml:space="preserve">A </w:t>
+      </w:r>
+      <w:proofErr w:type="spellStart"/>
+      <w:r>
+        <w:rPr>
+          <w:sz w:val="24"/>
+          <w:szCs w:val="24"/>
+        </w:rPr>
+        <w:t>ProjectTask</w:t>
+      </w:r>
+      <w:proofErr w:type="spellEnd"/>
+      <w:r>
+        <w:rPr>
+          <w:sz w:val="24"/>
+          <w:szCs w:val="24"/>
+        </w:rPr>
+        <w:t xml:space="preserve"> has many </w:t>
+      </w:r>
+      <w:proofErr w:type="spellStart"/>
+      <w:r>
+        <w:rPr>
+          <w:sz w:val="24"/>
+          <w:szCs w:val="24"/>
+        </w:rPr>
+        <w:t>SubTasks</w:t>
+      </w:r>
+      <w:proofErr w:type="spellEnd"/>
+      <w:r>
+        <w:rPr>
+          <w:sz w:val="24"/>
+          <w:szCs w:val="24"/>
+        </w:rPr>
+        <w:t xml:space="preserve"> and many Comments (1:M); each Comment also belongs to exactly one User (the commenter).</w:t>
       </w:r>
     </w:p>
     <w:p>
@@ -716,7 +1148,23 @@
           <w:sz w:val="24"/>
           <w:szCs w:val="24"/>
         </w:rPr>
-        <w:t>A User has many Notifications and many RefreshTokens (1:M) — every login issues a new refresh token, and old tokens are revoked (not deleted) on re-login, preserving history.</w:t>
+        <w:t xml:space="preserve">A User has many Notifications and many </w:t>
+      </w:r>
+      <w:proofErr w:type="spellStart"/>
+      <w:r>
+        <w:rPr>
+          <w:sz w:val="24"/>
+          <w:szCs w:val="24"/>
+        </w:rPr>
+        <w:t>RefreshTokens</w:t>
+      </w:r>
+      <w:proofErr w:type="spellEnd"/>
+      <w:r>
+        <w:rPr>
+          <w:sz w:val="24"/>
+          <w:szCs w:val="24"/>
+        </w:rPr>
+        <w:t xml:space="preserve"> (1:M) — every login issues a new refresh token, and old tokens are revoked (not deleted) on re-login, preserving history.</w:t>
       </w:r>
     </w:p>
     <w:p>
@@ -751,7 +1199,39 @@
           <w:sz w:val="24"/>
           <w:szCs w:val="24"/>
         </w:rPr>
-        <w:t>The five tables below are the core operational tables of NexusFlow's fourteen-table schema. Field sizes shown are the actual constraints configured in NexusFlowDbContext (via Entity Framework Core's Fluent API); fields without a stated size are stored as nvarchar(max) or their natural SQL type.</w:t>
+        <w:t xml:space="preserve">The five tables below are the core operational tables of NexusFlow's fourteen-table schema. Field sizes shown are the actual constraints configured in </w:t>
+      </w:r>
+      <w:proofErr w:type="spellStart"/>
+      <w:r>
+        <w:rPr>
+          <w:sz w:val="24"/>
+          <w:szCs w:val="24"/>
+        </w:rPr>
+        <w:t>NexusFlowDbContext</w:t>
+      </w:r>
+      <w:proofErr w:type="spellEnd"/>
+      <w:r>
+        <w:rPr>
+          <w:sz w:val="24"/>
+          <w:szCs w:val="24"/>
+        </w:rPr>
+        <w:t xml:space="preserve"> (via Entity Framework Core's Fluent API); fields without a stated size are stored as </w:t>
+      </w:r>
+      <w:proofErr w:type="spellStart"/>
+      <w:r>
+        <w:rPr>
+          <w:sz w:val="24"/>
+          <w:szCs w:val="24"/>
+        </w:rPr>
+        <w:t>nvarchar</w:t>
+      </w:r>
+      <w:proofErr w:type="spellEnd"/>
+      <w:r>
+        <w:rPr>
+          <w:sz w:val="24"/>
+          <w:szCs w:val="24"/>
+        </w:rPr>
+        <w:t>(max) or their natural SQL type.</w:t>
       </w:r>
     </w:p>
     <w:p>
@@ -998,9 +1478,11 @@
             <w:pPr>
               <w:spacing w:line="276" w:lineRule="auto"/>
             </w:pPr>
+            <w:proofErr w:type="spellStart"/>
             <w:r>
               <w:t>FullName</w:t>
             </w:r>
+            <w:proofErr w:type="spellEnd"/>
           </w:p>
         </w:tc>
         <w:tc>
@@ -1018,9 +1500,11 @@
             <w:pPr>
               <w:spacing w:line="276" w:lineRule="auto"/>
             </w:pPr>
+            <w:proofErr w:type="spellStart"/>
             <w:r>
               <w:t>nvarchar</w:t>
             </w:r>
+            <w:proofErr w:type="spellEnd"/>
           </w:p>
         </w:tc>
         <w:tc>
@@ -1100,9 +1584,11 @@
             <w:pPr>
               <w:spacing w:line="276" w:lineRule="auto"/>
             </w:pPr>
+            <w:proofErr w:type="spellStart"/>
             <w:r>
               <w:t>nvarchar</w:t>
             </w:r>
+            <w:proofErr w:type="spellEnd"/>
           </w:p>
         </w:tc>
         <w:tc>
@@ -1162,9 +1648,11 @@
             <w:pPr>
               <w:spacing w:line="276" w:lineRule="auto"/>
             </w:pPr>
+            <w:proofErr w:type="spellStart"/>
             <w:r>
               <w:t>PasswordHash</w:t>
             </w:r>
+            <w:proofErr w:type="spellEnd"/>
           </w:p>
         </w:tc>
         <w:tc>
@@ -1182,9 +1670,11 @@
             <w:pPr>
               <w:spacing w:line="276" w:lineRule="auto"/>
             </w:pPr>
+            <w:proofErr w:type="spellStart"/>
             <w:r>
               <w:t>nvarchar</w:t>
             </w:r>
+            <w:proofErr w:type="spellEnd"/>
           </w:p>
         </w:tc>
         <w:tc>
@@ -1222,8 +1712,13 @@
             <w:pPr>
               <w:spacing w:line="276" w:lineRule="auto"/>
             </w:pPr>
-            <w:r>
-              <w:t>BCrypt hash of the password (never plain text)</w:t>
+            <w:proofErr w:type="spellStart"/>
+            <w:r>
+              <w:t>BCrypt</w:t>
+            </w:r>
+            <w:proofErr w:type="spellEnd"/>
+            <w:r>
+              <w:t xml:space="preserve"> hash of the password (never plain text)</w:t>
             </w:r>
           </w:p>
         </w:tc>
@@ -1305,7 +1800,23 @@
               <w:spacing w:line="276" w:lineRule="auto"/>
             </w:pPr>
             <w:r>
-              <w:t>Enum: Admin=1, ProjectManager=2, TeamMember=3, Client=4</w:t>
+              <w:t xml:space="preserve">Enum: Admin=1, </w:t>
+            </w:r>
+            <w:proofErr w:type="spellStart"/>
+            <w:r>
+              <w:t>ProjectManager</w:t>
+            </w:r>
+            <w:proofErr w:type="spellEnd"/>
+            <w:r>
+              <w:t xml:space="preserve">=2, </w:t>
+            </w:r>
+            <w:proofErr w:type="spellStart"/>
+            <w:r>
+              <w:t>TeamMember</w:t>
+            </w:r>
+            <w:proofErr w:type="spellEnd"/>
+            <w:r>
+              <w:t>=3, Client=4</w:t>
             </w:r>
           </w:p>
         </w:tc>
@@ -1326,9 +1837,11 @@
             <w:pPr>
               <w:spacing w:line="276" w:lineRule="auto"/>
             </w:pPr>
+            <w:proofErr w:type="spellStart"/>
             <w:r>
               <w:t>PhoneNumber</w:t>
             </w:r>
+            <w:proofErr w:type="spellEnd"/>
           </w:p>
         </w:tc>
         <w:tc>
@@ -1346,9 +1859,11 @@
             <w:pPr>
               <w:spacing w:line="276" w:lineRule="auto"/>
             </w:pPr>
+            <w:proofErr w:type="spellStart"/>
             <w:r>
               <w:t>nvarchar</w:t>
             </w:r>
+            <w:proofErr w:type="spellEnd"/>
           </w:p>
         </w:tc>
         <w:tc>
@@ -1408,9 +1923,11 @@
             <w:pPr>
               <w:spacing w:line="276" w:lineRule="auto"/>
             </w:pPr>
+            <w:proofErr w:type="spellStart"/>
             <w:r>
               <w:t>OrganizationId</w:t>
             </w:r>
+            <w:proofErr w:type="spellEnd"/>
           </w:p>
         </w:tc>
         <w:tc>
@@ -1490,9 +2007,19 @@
             <w:pPr>
               <w:spacing w:line="276" w:lineRule="auto"/>
             </w:pPr>
-            <w:r>
-              <w:t>CreatedAt / UpdatedAt</w:t>
-            </w:r>
+            <w:proofErr w:type="spellStart"/>
+            <w:r>
+              <w:t>CreatedAt</w:t>
+            </w:r>
+            <w:proofErr w:type="spellEnd"/>
+            <w:r>
+              <w:t xml:space="preserve"> / </w:t>
+            </w:r>
+            <w:proofErr w:type="spellStart"/>
+            <w:r>
+              <w:t>UpdatedAt</w:t>
+            </w:r>
+            <w:proofErr w:type="spellEnd"/>
           </w:p>
         </w:tc>
         <w:tc>
@@ -1551,7 +2078,15 @@
               <w:spacing w:line="276" w:lineRule="auto"/>
             </w:pPr>
             <w:r>
-              <w:t>Audit timestamps (inherited from BaseEntity)</w:t>
+              <w:t xml:space="preserve">Audit timestamps (inherited from </w:t>
+            </w:r>
+            <w:proofErr w:type="spellStart"/>
+            <w:r>
+              <w:t>BaseEntity</w:t>
+            </w:r>
+            <w:proofErr w:type="spellEnd"/>
+            <w:r>
+              <w:t>)</w:t>
             </w:r>
           </w:p>
         </w:tc>
@@ -1572,9 +2107,19 @@
             <w:pPr>
               <w:spacing w:line="276" w:lineRule="auto"/>
             </w:pPr>
-            <w:r>
-              <w:t>IsDeleted / IsActive</w:t>
-            </w:r>
+            <w:proofErr w:type="spellStart"/>
+            <w:r>
+              <w:t>IsDeleted</w:t>
+            </w:r>
+            <w:proofErr w:type="spellEnd"/>
+            <w:r>
+              <w:t xml:space="preserve"> / </w:t>
+            </w:r>
+            <w:proofErr w:type="spellStart"/>
+            <w:r>
+              <w:t>IsActive</w:t>
+            </w:r>
+            <w:proofErr w:type="spellEnd"/>
           </w:p>
         </w:tc>
         <w:tc>
@@ -1950,9 +2495,11 @@
             <w:pPr>
               <w:spacing w:line="276" w:lineRule="auto"/>
             </w:pPr>
+            <w:proofErr w:type="spellStart"/>
             <w:r>
               <w:t>nvarchar</w:t>
             </w:r>
+            <w:proofErr w:type="spellEnd"/>
           </w:p>
         </w:tc>
         <w:tc>
@@ -2032,9 +2579,11 @@
             <w:pPr>
               <w:spacing w:line="276" w:lineRule="auto"/>
             </w:pPr>
+            <w:proofErr w:type="spellStart"/>
             <w:r>
               <w:t>nvarchar</w:t>
             </w:r>
+            <w:proofErr w:type="spellEnd"/>
           </w:p>
         </w:tc>
         <w:tc>
@@ -2155,7 +2704,15 @@
               <w:spacing w:line="276" w:lineRule="auto"/>
             </w:pPr>
             <w:r>
-              <w:t>Enum: Planning=1, Active=2, OnHold=3, Completed=4, Cancelled=5</w:t>
+              <w:t xml:space="preserve">Enum: Planning=1, Active=2, </w:t>
+            </w:r>
+            <w:proofErr w:type="spellStart"/>
+            <w:r>
+              <w:t>OnHold</w:t>
+            </w:r>
+            <w:proofErr w:type="spellEnd"/>
+            <w:r>
+              <w:t>=3, Completed=4, Cancelled=5</w:t>
             </w:r>
           </w:p>
         </w:tc>
@@ -2177,8 +2734,13 @@
               <w:spacing w:line="276" w:lineRule="auto"/>
             </w:pPr>
             <w:r>
-              <w:t>StartDate / EndDate</w:t>
-            </w:r>
+              <w:t xml:space="preserve">StartDate / </w:t>
+            </w:r>
+            <w:proofErr w:type="spellStart"/>
+            <w:r>
+              <w:t>EndDate</w:t>
+            </w:r>
+            <w:proofErr w:type="spellEnd"/>
           </w:p>
         </w:tc>
         <w:tc>
@@ -2258,9 +2820,11 @@
             <w:pPr>
               <w:spacing w:line="276" w:lineRule="auto"/>
             </w:pPr>
+            <w:proofErr w:type="spellStart"/>
             <w:r>
               <w:t>OrganizationId</w:t>
             </w:r>
+            <w:proofErr w:type="spellEnd"/>
           </w:p>
         </w:tc>
         <w:tc>
@@ -2340,9 +2904,11 @@
             <w:pPr>
               <w:spacing w:line="276" w:lineRule="auto"/>
             </w:pPr>
+            <w:proofErr w:type="spellStart"/>
             <w:r>
               <w:t>CreatedBy</w:t>
             </w:r>
+            <w:proofErr w:type="spellEnd"/>
           </w:p>
         </w:tc>
         <w:tc>
@@ -2431,8 +2997,19 @@
           <w:sz w:val="24"/>
           <w:szCs w:val="24"/>
         </w:rPr>
-        <w:t>Table: ProjectTasks</w:t>
-      </w:r>
+        <w:t xml:space="preserve">Table: </w:t>
+      </w:r>
+      <w:proofErr w:type="spellStart"/>
+      <w:r>
+        <w:rPr>
+          <w:b/>
+          <w:bCs/>
+          <w:sz w:val="24"/>
+          <w:szCs w:val="24"/>
+        </w:rPr>
+        <w:t>ProjectTasks</w:t>
+      </w:r>
+      <w:proofErr w:type="spellEnd"/>
     </w:p>
     <w:tbl>
       <w:tblPr>
@@ -2684,9 +3261,11 @@
             <w:pPr>
               <w:spacing w:line="276" w:lineRule="auto"/>
             </w:pPr>
+            <w:proofErr w:type="spellStart"/>
             <w:r>
               <w:t>nvarchar</w:t>
             </w:r>
+            <w:proofErr w:type="spellEnd"/>
           </w:p>
         </w:tc>
         <w:tc>
@@ -2766,9 +3345,11 @@
             <w:pPr>
               <w:spacing w:line="276" w:lineRule="auto"/>
             </w:pPr>
+            <w:proofErr w:type="spellStart"/>
             <w:r>
               <w:t>nvarchar</w:t>
             </w:r>
+            <w:proofErr w:type="spellEnd"/>
           </w:p>
         </w:tc>
         <w:tc>
@@ -2889,7 +3470,15 @@
               <w:spacing w:line="276" w:lineRule="auto"/>
             </w:pPr>
             <w:r>
-              <w:t>Enum: Todo=1, InProgress=2, InReview=3, Done=4, Cancelled=5</w:t>
+              <w:t xml:space="preserve">Enum: Todo=1, InProgress=2, </w:t>
+            </w:r>
+            <w:proofErr w:type="spellStart"/>
+            <w:r>
+              <w:t>InReview</w:t>
+            </w:r>
+            <w:proofErr w:type="spellEnd"/>
+            <w:r>
+              <w:t>=3, Done=4, Cancelled=5</w:t>
             </w:r>
           </w:p>
         </w:tc>
@@ -2992,9 +3581,11 @@
             <w:pPr>
               <w:spacing w:line="276" w:lineRule="auto"/>
             </w:pPr>
+            <w:proofErr w:type="spellStart"/>
             <w:r>
               <w:t>DueDate</w:t>
             </w:r>
+            <w:proofErr w:type="spellEnd"/>
           </w:p>
         </w:tc>
         <w:tc>
@@ -3074,9 +3665,11 @@
             <w:pPr>
               <w:spacing w:line="276" w:lineRule="auto"/>
             </w:pPr>
+            <w:proofErr w:type="spellStart"/>
             <w:r>
               <w:t>ProjectId</w:t>
             </w:r>
+            <w:proofErr w:type="spellEnd"/>
           </w:p>
         </w:tc>
         <w:tc>
@@ -3156,9 +3749,11 @@
             <w:pPr>
               <w:spacing w:line="276" w:lineRule="auto"/>
             </w:pPr>
+            <w:proofErr w:type="spellStart"/>
             <w:r>
               <w:t>CreatedBy</w:t>
             </w:r>
+            <w:proofErr w:type="spellEnd"/>
           </w:p>
         </w:tc>
         <w:tc>
@@ -3233,8 +3828,17 @@
           <w:i/>
           <w:iCs/>
         </w:rPr>
-        <w:t>Table 3.3: Field Specification — ProjectTasks</w:t>
-      </w:r>
+        <w:t xml:space="preserve">Table 3.3: Field Specification — </w:t>
+      </w:r>
+      <w:proofErr w:type="spellStart"/>
+      <w:r>
+        <w:rPr>
+          <w:i/>
+          <w:iCs/>
+        </w:rPr>
+        <w:t>ProjectTasks</w:t>
+      </w:r>
+      <w:proofErr w:type="spellEnd"/>
     </w:p>
     <w:p>
       <w:pPr>
@@ -3500,9 +4104,11 @@
             <w:pPr>
               <w:spacing w:line="276" w:lineRule="auto"/>
             </w:pPr>
+            <w:proofErr w:type="spellStart"/>
             <w:r>
               <w:t>nvarchar</w:t>
             </w:r>
+            <w:proofErr w:type="spellEnd"/>
           </w:p>
         </w:tc>
         <w:tc>
@@ -3562,9 +4168,11 @@
             <w:pPr>
               <w:spacing w:line="276" w:lineRule="auto"/>
             </w:pPr>
+            <w:proofErr w:type="spellStart"/>
             <w:r>
               <w:t>TaskId</w:t>
             </w:r>
+            <w:proofErr w:type="spellEnd"/>
           </w:p>
         </w:tc>
         <w:tc>
@@ -3623,8 +4231,13 @@
               <w:spacing w:line="276" w:lineRule="auto"/>
             </w:pPr>
             <w:r>
-              <w:t>Foreign key to ProjectTasks</w:t>
-            </w:r>
+              <w:t xml:space="preserve">Foreign key to </w:t>
+            </w:r>
+            <w:proofErr w:type="spellStart"/>
+            <w:r>
+              <w:t>ProjectTasks</w:t>
+            </w:r>
+            <w:proofErr w:type="spellEnd"/>
           </w:p>
         </w:tc>
       </w:tr>
@@ -3644,9 +4257,11 @@
             <w:pPr>
               <w:spacing w:line="276" w:lineRule="auto"/>
             </w:pPr>
+            <w:proofErr w:type="spellStart"/>
             <w:r>
               <w:t>UserId</w:t>
             </w:r>
+            <w:proofErr w:type="spellEnd"/>
           </w:p>
         </w:tc>
         <w:tc>
@@ -4000,9 +4615,11 @@
             <w:pPr>
               <w:spacing w:line="276" w:lineRule="auto"/>
             </w:pPr>
+            <w:proofErr w:type="spellStart"/>
             <w:r>
               <w:t>nvarchar</w:t>
             </w:r>
+            <w:proofErr w:type="spellEnd"/>
           </w:p>
         </w:tc>
         <w:tc>
@@ -4082,9 +4699,11 @@
             <w:pPr>
               <w:spacing w:line="276" w:lineRule="auto"/>
             </w:pPr>
+            <w:proofErr w:type="spellStart"/>
             <w:r>
               <w:t>nvarchar</w:t>
             </w:r>
+            <w:proofErr w:type="spellEnd"/>
           </w:p>
         </w:tc>
         <w:tc>
@@ -4144,9 +4763,11 @@
             <w:pPr>
               <w:spacing w:line="276" w:lineRule="auto"/>
             </w:pPr>
+            <w:proofErr w:type="spellStart"/>
             <w:r>
               <w:t>IsRead</w:t>
             </w:r>
+            <w:proofErr w:type="spellEnd"/>
           </w:p>
         </w:tc>
         <w:tc>
@@ -4287,7 +4908,15 @@
               <w:spacing w:line="276" w:lineRule="auto"/>
             </w:pPr>
             <w:r>
-              <w:t>Enum: TaskAssigned=1 (extensible for future event types)</w:t>
+              <w:t xml:space="preserve">Enum: </w:t>
+            </w:r>
+            <w:proofErr w:type="spellStart"/>
+            <w:r>
+              <w:t>TaskAssigned</w:t>
+            </w:r>
+            <w:proofErr w:type="spellEnd"/>
+            <w:r>
+              <w:t>=1 (extensible for future event types)</w:t>
             </w:r>
           </w:p>
         </w:tc>
@@ -4308,9 +4937,11 @@
             <w:pPr>
               <w:spacing w:line="276" w:lineRule="auto"/>
             </w:pPr>
+            <w:proofErr w:type="spellStart"/>
             <w:r>
               <w:t>UserId</w:t>
             </w:r>
+            <w:proofErr w:type="spellEnd"/>
           </w:p>
         </w:tc>
         <w:tc>
@@ -4398,7 +5029,215 @@
           <w:sz w:val="24"/>
           <w:szCs w:val="24"/>
         </w:rPr>
-        <w:t>The remaining nine tables (Organizations, Departments, Teams, TeamMembers, ProjectMembers, SubTasks, TaskAssignees, RefreshTokens, AuditLogs) follow the same pattern — an int identity primary key, foreign keys to their parent entities, and the CreatedAt/UpdatedAt/CreatedBy/UpdatedBy/IsDeleted/IsActive audit columns inherited from the common BaseEntity base class.</w:t>
+        <w:t xml:space="preserve">The remaining nine tables (Organizations, Departments, Teams, </w:t>
+      </w:r>
+      <w:proofErr w:type="spellStart"/>
+      <w:r>
+        <w:rPr>
+          <w:sz w:val="24"/>
+          <w:szCs w:val="24"/>
+        </w:rPr>
+        <w:t>TeamMembers</w:t>
+      </w:r>
+      <w:proofErr w:type="spellEnd"/>
+      <w:r>
+        <w:rPr>
+          <w:sz w:val="24"/>
+          <w:szCs w:val="24"/>
+        </w:rPr>
+        <w:t xml:space="preserve">, </w:t>
+      </w:r>
+      <w:proofErr w:type="spellStart"/>
+      <w:r>
+        <w:rPr>
+          <w:sz w:val="24"/>
+          <w:szCs w:val="24"/>
+        </w:rPr>
+        <w:t>ProjectMembers</w:t>
+      </w:r>
+      <w:proofErr w:type="spellEnd"/>
+      <w:r>
+        <w:rPr>
+          <w:sz w:val="24"/>
+          <w:szCs w:val="24"/>
+        </w:rPr>
+        <w:t xml:space="preserve">, </w:t>
+      </w:r>
+      <w:proofErr w:type="spellStart"/>
+      <w:r>
+        <w:rPr>
+          <w:sz w:val="24"/>
+          <w:szCs w:val="24"/>
+        </w:rPr>
+        <w:t>SubTasks</w:t>
+      </w:r>
+      <w:proofErr w:type="spellEnd"/>
+      <w:r>
+        <w:rPr>
+          <w:sz w:val="24"/>
+          <w:szCs w:val="24"/>
+        </w:rPr>
+        <w:t xml:space="preserve">, </w:t>
+      </w:r>
+      <w:proofErr w:type="spellStart"/>
+      <w:r>
+        <w:rPr>
+          <w:sz w:val="24"/>
+          <w:szCs w:val="24"/>
+        </w:rPr>
+        <w:t>TaskAssignees</w:t>
+      </w:r>
+      <w:proofErr w:type="spellEnd"/>
+      <w:r>
+        <w:rPr>
+          <w:sz w:val="24"/>
+          <w:szCs w:val="24"/>
+        </w:rPr>
+        <w:t xml:space="preserve">, </w:t>
+      </w:r>
+      <w:proofErr w:type="spellStart"/>
+      <w:r>
+        <w:rPr>
+          <w:sz w:val="24"/>
+          <w:szCs w:val="24"/>
+        </w:rPr>
+        <w:t>RefreshTokens</w:t>
+      </w:r>
+      <w:proofErr w:type="spellEnd"/>
+      <w:r>
+        <w:rPr>
+          <w:sz w:val="24"/>
+          <w:szCs w:val="24"/>
+        </w:rPr>
+        <w:t xml:space="preserve">, </w:t>
+      </w:r>
+      <w:proofErr w:type="spellStart"/>
+      <w:r>
+        <w:rPr>
+          <w:sz w:val="24"/>
+          <w:szCs w:val="24"/>
+        </w:rPr>
+        <w:t>AuditLogs</w:t>
+      </w:r>
+      <w:proofErr w:type="spellEnd"/>
+      <w:r>
+        <w:rPr>
+          <w:sz w:val="24"/>
+          <w:szCs w:val="24"/>
+        </w:rPr>
+        <w:t xml:space="preserve">) follow the same pattern — an int identity primary key, foreign keys to their parent entities, and the </w:t>
+      </w:r>
+      <w:proofErr w:type="spellStart"/>
+      <w:r>
+        <w:rPr>
+          <w:sz w:val="24"/>
+          <w:szCs w:val="24"/>
+        </w:rPr>
+        <w:t>CreatedAt</w:t>
+      </w:r>
+      <w:proofErr w:type="spellEnd"/>
+      <w:r>
+        <w:rPr>
+          <w:sz w:val="24"/>
+          <w:szCs w:val="24"/>
+        </w:rPr>
+        <w:t>/</w:t>
+      </w:r>
+      <w:proofErr w:type="spellStart"/>
+      <w:r>
+        <w:rPr>
+          <w:sz w:val="24"/>
+          <w:szCs w:val="24"/>
+        </w:rPr>
+        <w:t>UpdatedAt</w:t>
+      </w:r>
+      <w:proofErr w:type="spellEnd"/>
+      <w:r>
+        <w:rPr>
+          <w:sz w:val="24"/>
+          <w:szCs w:val="24"/>
+        </w:rPr>
+        <w:t>/</w:t>
+      </w:r>
+      <w:proofErr w:type="spellStart"/>
+      <w:r>
+        <w:rPr>
+          <w:sz w:val="24"/>
+          <w:szCs w:val="24"/>
+        </w:rPr>
+        <w:t>CreatedBy</w:t>
+      </w:r>
+      <w:proofErr w:type="spellEnd"/>
+      <w:r>
+        <w:rPr>
+          <w:sz w:val="24"/>
+          <w:szCs w:val="24"/>
+        </w:rPr>
+        <w:t>/</w:t>
+      </w:r>
+      <w:proofErr w:type="spellStart"/>
+      <w:r>
+        <w:rPr>
+          <w:sz w:val="24"/>
+          <w:szCs w:val="24"/>
+        </w:rPr>
+        <w:t>UpdatedBy</w:t>
+      </w:r>
+      <w:proofErr w:type="spellEnd"/>
+      <w:r>
+        <w:rPr>
+          <w:sz w:val="24"/>
+          <w:szCs w:val="24"/>
+        </w:rPr>
+        <w:t>/</w:t>
+      </w:r>
+      <w:proofErr w:type="spellStart"/>
+      <w:r>
+        <w:rPr>
+          <w:sz w:val="24"/>
+          <w:szCs w:val="24"/>
+        </w:rPr>
+        <w:t>IsDeleted</w:t>
+      </w:r>
+      <w:proofErr w:type="spellEnd"/>
+      <w:r>
+        <w:rPr>
+          <w:sz w:val="24"/>
+          <w:szCs w:val="24"/>
+        </w:rPr>
+        <w:t>/</w:t>
+      </w:r>
+      <w:proofErr w:type="spellStart"/>
+      <w:r>
+        <w:rPr>
+          <w:sz w:val="24"/>
+          <w:szCs w:val="24"/>
+        </w:rPr>
+        <w:t>IsActive</w:t>
+      </w:r>
+      <w:proofErr w:type="spellEnd"/>
+      <w:r>
+        <w:rPr>
+          <w:sz w:val="24"/>
+          <w:szCs w:val="24"/>
+        </w:rPr>
+        <w:t xml:space="preserve"> audit columns inherited from the common </w:t>
+      </w:r>
+      <w:proofErr w:type="spellStart"/>
+      <w:r>
+        <w:rPr>
+          <w:sz w:val="24"/>
+          <w:szCs w:val="24"/>
+        </w:rPr>
+        <w:t>BaseEntity</w:t>
+      </w:r>
+      <w:proofErr w:type="spellEnd"/>
+      <w:r>
+        <w:rPr>
+          <w:sz w:val="24"/>
+          <w:szCs w:val="24"/>
+        </w:rPr>
+        <w:t xml:space="preserve"> base class.</w:t>
       </w:r>
     </w:p>
     <w:p>
@@ -4426,7 +5265,39 @@
           <w:sz w:val="24"/>
           <w:szCs w:val="24"/>
         </w:rPr>
-        <w:t>Input validation is enforced server-side using FluentValidation, wired through a global ValidationFilter that runs automatically before every controller action — no controller or service method needs to call a validator manually. If validation fails, the API returns HTTP 400 with a list of human-readable error messages before any business logic executes.</w:t>
+        <w:t xml:space="preserve">Input validation is enforced server-side using </w:t>
+      </w:r>
+      <w:proofErr w:type="spellStart"/>
+      <w:r>
+        <w:rPr>
+          <w:sz w:val="24"/>
+          <w:szCs w:val="24"/>
+        </w:rPr>
+        <w:t>FluentValidation</w:t>
+      </w:r>
+      <w:proofErr w:type="spellEnd"/>
+      <w:r>
+        <w:rPr>
+          <w:sz w:val="24"/>
+          <w:szCs w:val="24"/>
+        </w:rPr>
+        <w:t xml:space="preserve">, wired through a global </w:t>
+      </w:r>
+      <w:proofErr w:type="spellStart"/>
+      <w:r>
+        <w:rPr>
+          <w:sz w:val="24"/>
+          <w:szCs w:val="24"/>
+        </w:rPr>
+        <w:t>ValidationFilter</w:t>
+      </w:r>
+      <w:proofErr w:type="spellEnd"/>
+      <w:r>
+        <w:rPr>
+          <w:sz w:val="24"/>
+          <w:szCs w:val="24"/>
+        </w:rPr>
+        <w:t xml:space="preserve"> that runs automatically before every controller action — no controller or service method needs to call a validator manually. If validation fails, the API returns HTTP 400 with a list of human-readable error messages before any business logic executes.</w:t>
       </w:r>
     </w:p>
     <w:tbl>
@@ -4570,9 +5441,11 @@
             <w:pPr>
               <w:spacing w:line="276" w:lineRule="auto"/>
             </w:pPr>
+            <w:proofErr w:type="spellStart"/>
             <w:r>
               <w:t>FullName</w:t>
             </w:r>
+            <w:proofErr w:type="spellEnd"/>
           </w:p>
         </w:tc>
         <w:tc>
@@ -4756,9 +5629,11 @@
             <w:pPr>
               <w:spacing w:line="276" w:lineRule="auto"/>
             </w:pPr>
+            <w:proofErr w:type="spellStart"/>
             <w:r>
               <w:t>ConfirmPassword</w:t>
             </w:r>
+            <w:proofErr w:type="spellEnd"/>
           </w:p>
         </w:tc>
         <w:tc>
@@ -4942,9 +5817,11 @@
             <w:pPr>
               <w:spacing w:line="276" w:lineRule="auto"/>
             </w:pPr>
+            <w:proofErr w:type="spellStart"/>
             <w:r>
               <w:t>EndDate</w:t>
             </w:r>
+            <w:proofErr w:type="spellEnd"/>
           </w:p>
         </w:tc>
         <w:tc>
@@ -5025,7 +5902,23 @@
               <w:spacing w:line="276" w:lineRule="auto"/>
             </w:pPr>
             <w:r>
-              <w:t>Must be a valid ProjectStatus enum value</w:t>
+              <w:t xml:space="preserve">Must be a valid </w:t>
+            </w:r>
+            <w:proofErr w:type="spellStart"/>
+            <w:r>
+              <w:t>ProjectStatus</w:t>
+            </w:r>
+            <w:proofErr w:type="spellEnd"/>
+            <w:r>
+              <w:t xml:space="preserve"> </w:t>
+            </w:r>
+            <w:proofErr w:type="spellStart"/>
+            <w:r>
+              <w:t>enum</w:t>
+            </w:r>
+            <w:proofErr w:type="spellEnd"/>
+            <w:r>
+              <w:t xml:space="preserve"> value</w:t>
             </w:r>
           </w:p>
         </w:tc>
@@ -5149,7 +6042,23 @@
               <w:spacing w:line="276" w:lineRule="auto"/>
             </w:pPr>
             <w:r>
-              <w:t>Must be a valid TaskPriority enum value</w:t>
+              <w:t xml:space="preserve">Must be a valid </w:t>
+            </w:r>
+            <w:proofErr w:type="spellStart"/>
+            <w:r>
+              <w:t>TaskPriority</w:t>
+            </w:r>
+            <w:proofErr w:type="spellEnd"/>
+            <w:r>
+              <w:t xml:space="preserve"> </w:t>
+            </w:r>
+            <w:proofErr w:type="spellStart"/>
+            <w:r>
+              <w:t>enum</w:t>
+            </w:r>
+            <w:proofErr w:type="spellEnd"/>
+            <w:r>
+              <w:t xml:space="preserve"> value</w:t>
             </w:r>
           </w:p>
         </w:tc>
@@ -5190,9 +6099,11 @@
             <w:pPr>
               <w:spacing w:line="276" w:lineRule="auto"/>
             </w:pPr>
+            <w:proofErr w:type="spellStart"/>
             <w:r>
               <w:t>AssigneeIds</w:t>
             </w:r>
+            <w:proofErr w:type="spellEnd"/>
           </w:p>
         </w:tc>
         <w:tc>
@@ -5478,7 +6389,15 @@
               <w:spacing w:line="276" w:lineRule="auto"/>
             </w:pPr>
             <w:r>
-              <w:t>Text input, multi-line textarea, status dropdown (edit only), date pickers</w:t>
+              <w:t xml:space="preserve">Text input, multi-line </w:t>
+            </w:r>
+            <w:proofErr w:type="spellStart"/>
+            <w:r>
+              <w:t>textarea</w:t>
+            </w:r>
+            <w:proofErr w:type="spellEnd"/>
+            <w:r>
+              <w:t>, status dropdown (edit only), date pickers</w:t>
             </w:r>
           </w:p>
         </w:tc>
@@ -5520,7 +6439,15 @@
               <w:spacing w:line="276" w:lineRule="auto"/>
             </w:pPr>
             <w:r>
-              <w:t>Text input, textarea, priority dropdown, status dropdown (edit only), multi-select dropdown (assignees), date picker</w:t>
+              <w:t xml:space="preserve">Text input, </w:t>
+            </w:r>
+            <w:proofErr w:type="spellStart"/>
+            <w:r>
+              <w:t>textarea</w:t>
+            </w:r>
+            <w:proofErr w:type="spellEnd"/>
+            <w:r>
+              <w:t>, priority dropdown, status dropdown (edit only), multi-select dropdown (assignees), date picker</w:t>
             </w:r>
           </w:p>
         </w:tc>
@@ -5907,13 +6834,38 @@
         <w:spacing w:after="80" w:line="360" w:lineRule="auto"/>
         <w:jc w:val="both"/>
       </w:pPr>
+      <w:proofErr w:type="spellStart"/>
       <w:r>
         <w:rPr>
           <w:sz w:val="24"/>
           <w:szCs w:val="24"/>
         </w:rPr>
         <w:lastRenderedPageBreak/>
-        <w:t>NexusFlow.Domain — entities, enums, and repository interfaces only. No dependency on any other project.</w:t>
+        <w:t>NexusFlow.Domain</w:t>
+      </w:r>
+      <w:proofErr w:type="spellEnd"/>
+      <w:r>
+        <w:rPr>
+          <w:sz w:val="24"/>
+          <w:szCs w:val="24"/>
+        </w:rPr>
+        <w:t xml:space="preserve"> — entities, </w:t>
+      </w:r>
+      <w:proofErr w:type="spellStart"/>
+      <w:r>
+        <w:rPr>
+          <w:sz w:val="24"/>
+          <w:szCs w:val="24"/>
+        </w:rPr>
+        <w:t>enums</w:t>
+      </w:r>
+      <w:proofErr w:type="spellEnd"/>
+      <w:r>
+        <w:rPr>
+          <w:sz w:val="24"/>
+          <w:szCs w:val="24"/>
+        </w:rPr>
+        <w:t>, and repository interfaces only. No dependency on any other project.</w:t>
       </w:r>
     </w:p>
     <w:p>
@@ -5926,12 +6878,53 @@
         <w:spacing w:after="80" w:line="360" w:lineRule="auto"/>
         <w:jc w:val="both"/>
       </w:pPr>
-      <w:r>
-        <w:rPr>
-          <w:sz w:val="24"/>
-          <w:szCs w:val="24"/>
-        </w:rPr>
-        <w:t>NexusFlow.Application — DTOs, service interfaces and implementations (business logic), AutoMapper profiles, FluentValidation validators. Depends only on Domain.</w:t>
+      <w:proofErr w:type="spellStart"/>
+      <w:r>
+        <w:rPr>
+          <w:sz w:val="24"/>
+          <w:szCs w:val="24"/>
+        </w:rPr>
+        <w:t>NexusFlow.Application</w:t>
+      </w:r>
+      <w:proofErr w:type="spellEnd"/>
+      <w:r>
+        <w:rPr>
+          <w:sz w:val="24"/>
+          <w:szCs w:val="24"/>
+        </w:rPr>
+        <w:t xml:space="preserve"> — DTOs, service interfaces and implementations (business logic), </w:t>
+      </w:r>
+      <w:proofErr w:type="spellStart"/>
+      <w:r>
+        <w:rPr>
+          <w:sz w:val="24"/>
+          <w:szCs w:val="24"/>
+        </w:rPr>
+        <w:t>AutoMapper</w:t>
+      </w:r>
+      <w:proofErr w:type="spellEnd"/>
+      <w:r>
+        <w:rPr>
+          <w:sz w:val="24"/>
+          <w:szCs w:val="24"/>
+        </w:rPr>
+        <w:t xml:space="preserve"> profiles, </w:t>
+      </w:r>
+      <w:proofErr w:type="spellStart"/>
+      <w:r>
+        <w:rPr>
+          <w:sz w:val="24"/>
+          <w:szCs w:val="24"/>
+        </w:rPr>
+        <w:t>FluentValidation</w:t>
+      </w:r>
+      <w:proofErr w:type="spellEnd"/>
+      <w:r>
+        <w:rPr>
+          <w:sz w:val="24"/>
+          <w:szCs w:val="24"/>
+        </w:rPr>
+        <w:t xml:space="preserve"> validators. Depends only on Domain.</w:t>
       </w:r>
     </w:p>
     <w:p>
@@ -5944,12 +6937,53 @@
         <w:spacing w:after="80" w:line="360" w:lineRule="auto"/>
         <w:jc w:val="both"/>
       </w:pPr>
-      <w:r>
-        <w:rPr>
-          <w:sz w:val="24"/>
-          <w:szCs w:val="24"/>
-        </w:rPr>
-        <w:t>NexusFlow.Infrastructure — EF Core DbContext, the generic Repository and UnitOfWork implementations. Implements Domain's interfaces.</w:t>
+      <w:proofErr w:type="spellStart"/>
+      <w:r>
+        <w:rPr>
+          <w:sz w:val="24"/>
+          <w:szCs w:val="24"/>
+        </w:rPr>
+        <w:t>NexusFlow.Infrastructure</w:t>
+      </w:r>
+      <w:proofErr w:type="spellEnd"/>
+      <w:r>
+        <w:rPr>
+          <w:sz w:val="24"/>
+          <w:szCs w:val="24"/>
+        </w:rPr>
+        <w:t xml:space="preserve"> — EF Core </w:t>
+      </w:r>
+      <w:proofErr w:type="spellStart"/>
+      <w:r>
+        <w:rPr>
+          <w:sz w:val="24"/>
+          <w:szCs w:val="24"/>
+        </w:rPr>
+        <w:t>DbContext</w:t>
+      </w:r>
+      <w:proofErr w:type="spellEnd"/>
+      <w:r>
+        <w:rPr>
+          <w:sz w:val="24"/>
+          <w:szCs w:val="24"/>
+        </w:rPr>
+        <w:t xml:space="preserve">, the generic Repository and </w:t>
+      </w:r>
+      <w:proofErr w:type="spellStart"/>
+      <w:r>
+        <w:rPr>
+          <w:sz w:val="24"/>
+          <w:szCs w:val="24"/>
+        </w:rPr>
+        <w:t>UnitOfWork</w:t>
+      </w:r>
+      <w:proofErr w:type="spellEnd"/>
+      <w:r>
+        <w:rPr>
+          <w:sz w:val="24"/>
+          <w:szCs w:val="24"/>
+        </w:rPr>
+        <w:t xml:space="preserve"> implementations. Implements Domain's interfaces.</w:t>
       </w:r>
     </w:p>
     <w:p>
@@ -5962,12 +6996,37 @@
         <w:spacing w:after="80" w:line="360" w:lineRule="auto"/>
         <w:jc w:val="both"/>
       </w:pPr>
-      <w:r>
-        <w:rPr>
-          <w:sz w:val="24"/>
-          <w:szCs w:val="24"/>
-        </w:rPr>
-        <w:t>NexusFlow.API — controllers, middleware, and DI wiring in Program.cs. The only layer aware of HTTP concerns.</w:t>
+      <w:proofErr w:type="spellStart"/>
+      <w:r>
+        <w:rPr>
+          <w:sz w:val="24"/>
+          <w:szCs w:val="24"/>
+        </w:rPr>
+        <w:t>NexusFlow.API</w:t>
+      </w:r>
+      <w:proofErr w:type="spellEnd"/>
+      <w:r>
+        <w:rPr>
+          <w:sz w:val="24"/>
+          <w:szCs w:val="24"/>
+        </w:rPr>
+        <w:t xml:space="preserve"> — controllers, middleware, and DI wiring in </w:t>
+      </w:r>
+      <w:proofErr w:type="spellStart"/>
+      <w:r>
+        <w:rPr>
+          <w:sz w:val="24"/>
+          <w:szCs w:val="24"/>
+        </w:rPr>
+        <w:t>Program.cs</w:t>
+      </w:r>
+      <w:proofErr w:type="spellEnd"/>
+      <w:r>
+        <w:rPr>
+          <w:sz w:val="24"/>
+          <w:szCs w:val="24"/>
+        </w:rPr>
+        <w:t>. The only layer aware of HTTP concerns.</w:t>
       </w:r>
     </w:p>
     <w:p>
@@ -5980,7 +7039,55 @@
           <w:sz w:val="24"/>
           <w:szCs w:val="24"/>
         </w:rPr>
-        <w:t>Every service method follows the same pattern — fetch via the generic repository, apply business rules, map to DTO via AutoMapper, and return a uniform ApiResponse&lt;T&gt; wrapper. The snippet below (from TaskService) illustrates this pattern as actually implemented:</w:t>
+        <w:t xml:space="preserve">Every service method follows the same pattern — fetch via the generic repository, apply business rules, map to DTO via </w:t>
+      </w:r>
+      <w:proofErr w:type="spellStart"/>
+      <w:r>
+        <w:rPr>
+          <w:sz w:val="24"/>
+          <w:szCs w:val="24"/>
+        </w:rPr>
+        <w:t>AutoMapper</w:t>
+      </w:r>
+      <w:proofErr w:type="spellEnd"/>
+      <w:r>
+        <w:rPr>
+          <w:sz w:val="24"/>
+          <w:szCs w:val="24"/>
+        </w:rPr>
+        <w:t xml:space="preserve">, and return a uniform </w:t>
+      </w:r>
+      <w:proofErr w:type="spellStart"/>
+      <w:r>
+        <w:rPr>
+          <w:sz w:val="24"/>
+          <w:szCs w:val="24"/>
+        </w:rPr>
+        <w:t>ApiResponse</w:t>
+      </w:r>
+      <w:proofErr w:type="spellEnd"/>
+      <w:r>
+        <w:rPr>
+          <w:sz w:val="24"/>
+          <w:szCs w:val="24"/>
+        </w:rPr>
+        <w:t xml:space="preserve">&lt;T&gt; wrapper. The snippet below (from </w:t>
+      </w:r>
+      <w:proofErr w:type="spellStart"/>
+      <w:r>
+        <w:rPr>
+          <w:sz w:val="24"/>
+          <w:szCs w:val="24"/>
+        </w:rPr>
+        <w:t>TaskService</w:t>
+      </w:r>
+      <w:proofErr w:type="spellEnd"/>
+      <w:r>
+        <w:rPr>
+          <w:sz w:val="24"/>
+          <w:szCs w:val="24"/>
+        </w:rPr>
+        <w:t>) illustrates this pattern as actually implemented:</w:t>
       </w:r>
     </w:p>
     <w:p>
@@ -6000,145 +7107,115 @@
           <w:sz w:val="18"/>
           <w:szCs w:val="18"/>
         </w:rPr>
-        <w:t>public async Task&lt;ApiResponse&lt;TaskDto&gt;&gt; CreateAsync(CreateTaskDto dto, int userId)</w:t>
-      </w:r>
-      <w:r>
-        <w:br/>
-      </w:r>
+        <w:t>public async Task&lt;</w:t>
+      </w:r>
+      <w:proofErr w:type="spellStart"/>
       <w:r>
         <w:rPr>
           <w:rFonts w:eastAsia="Consolas"/>
           <w:sz w:val="18"/>
           <w:szCs w:val="18"/>
         </w:rPr>
-        <w:t>{</w:t>
-      </w:r>
-      <w:r>
-        <w:br/>
-      </w:r>
+        <w:t>ApiResponse</w:t>
+      </w:r>
+      <w:proofErr w:type="spellEnd"/>
       <w:r>
         <w:rPr>
           <w:rFonts w:eastAsia="Consolas"/>
           <w:sz w:val="18"/>
           <w:szCs w:val="18"/>
         </w:rPr>
-        <w:t xml:space="preserve">    var task = _mapper.Map&lt;ProjectTask&gt;(dto);</w:t>
-      </w:r>
-      <w:r>
-        <w:br/>
-      </w:r>
+        <w:t>&lt;</w:t>
+      </w:r>
+      <w:proofErr w:type="spellStart"/>
       <w:r>
         <w:rPr>
           <w:rFonts w:eastAsia="Consolas"/>
           <w:sz w:val="18"/>
           <w:szCs w:val="18"/>
         </w:rPr>
-        <w:t xml:space="preserve">    task.Status = TaskStatus.Todo;          // business rule: always starts at Todo</w:t>
-      </w:r>
-      <w:r>
-        <w:br/>
-      </w:r>
+        <w:t>TaskDto</w:t>
+      </w:r>
+      <w:proofErr w:type="spellEnd"/>
       <w:r>
         <w:rPr>
           <w:rFonts w:eastAsia="Consolas"/>
           <w:sz w:val="18"/>
           <w:szCs w:val="18"/>
         </w:rPr>
-        <w:t xml:space="preserve">    task.CreatedBy = userId;</w:t>
-      </w:r>
-      <w:r>
-        <w:br/>
-      </w:r>
-      <w:r>
-        <w:br/>
-      </w:r>
+        <w:t xml:space="preserve">&gt;&gt; </w:t>
+      </w:r>
+      <w:proofErr w:type="spellStart"/>
       <w:r>
         <w:rPr>
           <w:rFonts w:eastAsia="Consolas"/>
           <w:sz w:val="18"/>
           <w:szCs w:val="18"/>
         </w:rPr>
-        <w:t xml:space="preserve">    await _unitOfWork.Repository&lt;ProjectTask&gt;().AddAsync(task);</w:t>
-      </w:r>
-      <w:r>
-        <w:br/>
-      </w:r>
+        <w:t>CreateAsync</w:t>
+      </w:r>
+      <w:proofErr w:type="spellEnd"/>
       <w:r>
         <w:rPr>
           <w:rFonts w:eastAsia="Consolas"/>
           <w:sz w:val="18"/>
           <w:szCs w:val="18"/>
         </w:rPr>
-        <w:t xml:space="preserve">    await _unitOfWork.SaveChangesAsync();</w:t>
-      </w:r>
-      <w:r>
-        <w:br/>
-      </w:r>
-      <w:r>
-        <w:br/>
-      </w:r>
+        <w:t>(</w:t>
+      </w:r>
+      <w:proofErr w:type="spellStart"/>
       <w:r>
         <w:rPr>
           <w:rFonts w:eastAsia="Consolas"/>
           <w:sz w:val="18"/>
           <w:szCs w:val="18"/>
         </w:rPr>
-        <w:t xml:space="preserve">    foreach (var assigneeId in dto.AssigneeIds)</w:t>
-      </w:r>
-      <w:r>
-        <w:br/>
-      </w:r>
+        <w:t>CreateTaskDto</w:t>
+      </w:r>
+      <w:proofErr w:type="spellEnd"/>
       <w:r>
         <w:rPr>
           <w:rFonts w:eastAsia="Consolas"/>
           <w:sz w:val="18"/>
           <w:szCs w:val="18"/>
         </w:rPr>
-        <w:t xml:space="preserve">    {</w:t>
-      </w:r>
-      <w:r>
-        <w:br/>
-      </w:r>
+        <w:t xml:space="preserve"> </w:t>
+      </w:r>
+      <w:proofErr w:type="spellStart"/>
       <w:r>
         <w:rPr>
           <w:rFonts w:eastAsia="Consolas"/>
           <w:sz w:val="18"/>
           <w:szCs w:val="18"/>
         </w:rPr>
-        <w:t xml:space="preserve">        await _unitOfWork.Repository&lt;TaskAssignee&gt;().AddAsync(</w:t>
-      </w:r>
-      <w:r>
-        <w:br/>
-      </w:r>
+        <w:t>dto</w:t>
+      </w:r>
+      <w:proofErr w:type="spellEnd"/>
       <w:r>
         <w:rPr>
           <w:rFonts w:eastAsia="Consolas"/>
           <w:sz w:val="18"/>
           <w:szCs w:val="18"/>
         </w:rPr>
-        <w:t xml:space="preserve">            new TaskAssignee { TaskId = task.Id, UserId = assigneeId, CreatedBy = userId });</w:t>
-      </w:r>
-      <w:r>
-        <w:br/>
-      </w:r>
+        <w:t xml:space="preserve">, int </w:t>
+      </w:r>
+      <w:proofErr w:type="spellStart"/>
       <w:r>
         <w:rPr>
           <w:rFonts w:eastAsia="Consolas"/>
           <w:sz w:val="18"/>
           <w:szCs w:val="18"/>
         </w:rPr>
-        <w:t xml:space="preserve">        await _notificationService.CreateNotificationAsync(</w:t>
-      </w:r>
-      <w:r>
-        <w:br/>
-      </w:r>
+        <w:t>userId</w:t>
+      </w:r>
+      <w:proofErr w:type="spellEnd"/>
       <w:r>
         <w:rPr>
           <w:rFonts w:eastAsia="Consolas"/>
           <w:sz w:val="18"/>
           <w:szCs w:val="18"/>
         </w:rPr>
-        <w:t xml:space="preserve">            assigneeId, "New Task Assigned", $"...{task.Title}", NotificationType.TaskAssigned);</w:t>
+        <w:t>)</w:t>
       </w:r>
       <w:r>
         <w:br/>
@@ -6149,7 +7226,7 @@
           <w:sz w:val="18"/>
           <w:szCs w:val="18"/>
         </w:rPr>
-        <w:t xml:space="preserve">    }</w:t>
+        <w:t>{</w:t>
       </w:r>
       <w:r>
         <w:br/>
@@ -6160,17 +7237,731 @@
           <w:sz w:val="18"/>
           <w:szCs w:val="18"/>
         </w:rPr>
-        <w:t xml:space="preserve">    return ApiResponse&lt;TaskDto&gt;.Created(await EnrichAsync(_mapper.Map&lt;TaskDto&gt;(task), task));</w:t>
-      </w:r>
-      <w:r>
-        <w:br/>
-      </w:r>
+        <w:t xml:space="preserve">    var task = _</w:t>
+      </w:r>
+      <w:proofErr w:type="spellStart"/>
       <w:r>
         <w:rPr>
           <w:rFonts w:eastAsia="Consolas"/>
           <w:sz w:val="18"/>
           <w:szCs w:val="18"/>
         </w:rPr>
+        <w:t>mapper.Map</w:t>
+      </w:r>
+      <w:proofErr w:type="spellEnd"/>
+      <w:r>
+        <w:rPr>
+          <w:rFonts w:eastAsia="Consolas"/>
+          <w:sz w:val="18"/>
+          <w:szCs w:val="18"/>
+        </w:rPr>
+        <w:t>&lt;</w:t>
+      </w:r>
+      <w:proofErr w:type="spellStart"/>
+      <w:r>
+        <w:rPr>
+          <w:rFonts w:eastAsia="Consolas"/>
+          <w:sz w:val="18"/>
+          <w:szCs w:val="18"/>
+        </w:rPr>
+        <w:t>ProjectTask</w:t>
+      </w:r>
+      <w:proofErr w:type="spellEnd"/>
+      <w:r>
+        <w:rPr>
+          <w:rFonts w:eastAsia="Consolas"/>
+          <w:sz w:val="18"/>
+          <w:szCs w:val="18"/>
+        </w:rPr>
+        <w:t>&gt;(</w:t>
+      </w:r>
+      <w:proofErr w:type="spellStart"/>
+      <w:r>
+        <w:rPr>
+          <w:rFonts w:eastAsia="Consolas"/>
+          <w:sz w:val="18"/>
+          <w:szCs w:val="18"/>
+        </w:rPr>
+        <w:t>dto</w:t>
+      </w:r>
+      <w:proofErr w:type="spellEnd"/>
+      <w:r>
+        <w:rPr>
+          <w:rFonts w:eastAsia="Consolas"/>
+          <w:sz w:val="18"/>
+          <w:szCs w:val="18"/>
+        </w:rPr>
+        <w:t>);</w:t>
+      </w:r>
+      <w:r>
+        <w:br/>
+      </w:r>
+      <w:r>
+        <w:rPr>
+          <w:rFonts w:eastAsia="Consolas"/>
+          <w:sz w:val="18"/>
+          <w:szCs w:val="18"/>
+        </w:rPr>
+        <w:t xml:space="preserve">    </w:t>
+      </w:r>
+      <w:proofErr w:type="spellStart"/>
+      <w:r>
+        <w:rPr>
+          <w:rFonts w:eastAsia="Consolas"/>
+          <w:sz w:val="18"/>
+          <w:szCs w:val="18"/>
+        </w:rPr>
+        <w:t>task.Status</w:t>
+      </w:r>
+      <w:proofErr w:type="spellEnd"/>
+      <w:r>
+        <w:rPr>
+          <w:rFonts w:eastAsia="Consolas"/>
+          <w:sz w:val="18"/>
+          <w:szCs w:val="18"/>
+        </w:rPr>
+        <w:t xml:space="preserve"> = </w:t>
+      </w:r>
+      <w:proofErr w:type="spellStart"/>
+      <w:r>
+        <w:rPr>
+          <w:rFonts w:eastAsia="Consolas"/>
+          <w:sz w:val="18"/>
+          <w:szCs w:val="18"/>
+        </w:rPr>
+        <w:t>TaskStatus.Todo</w:t>
+      </w:r>
+      <w:proofErr w:type="spellEnd"/>
+      <w:r>
+        <w:rPr>
+          <w:rFonts w:eastAsia="Consolas"/>
+          <w:sz w:val="18"/>
+          <w:szCs w:val="18"/>
+        </w:rPr>
+        <w:t>;          // business rule: always starts at Todo</w:t>
+      </w:r>
+      <w:r>
+        <w:br/>
+      </w:r>
+      <w:r>
+        <w:rPr>
+          <w:rFonts w:eastAsia="Consolas"/>
+          <w:sz w:val="18"/>
+          <w:szCs w:val="18"/>
+        </w:rPr>
+        <w:t xml:space="preserve">    </w:t>
+      </w:r>
+      <w:proofErr w:type="spellStart"/>
+      <w:r>
+        <w:rPr>
+          <w:rFonts w:eastAsia="Consolas"/>
+          <w:sz w:val="18"/>
+          <w:szCs w:val="18"/>
+        </w:rPr>
+        <w:t>task.CreatedBy</w:t>
+      </w:r>
+      <w:proofErr w:type="spellEnd"/>
+      <w:r>
+        <w:rPr>
+          <w:rFonts w:eastAsia="Consolas"/>
+          <w:sz w:val="18"/>
+          <w:szCs w:val="18"/>
+        </w:rPr>
+        <w:t xml:space="preserve"> = </w:t>
+      </w:r>
+      <w:proofErr w:type="spellStart"/>
+      <w:r>
+        <w:rPr>
+          <w:rFonts w:eastAsia="Consolas"/>
+          <w:sz w:val="18"/>
+          <w:szCs w:val="18"/>
+        </w:rPr>
+        <w:t>userId</w:t>
+      </w:r>
+      <w:proofErr w:type="spellEnd"/>
+      <w:r>
+        <w:rPr>
+          <w:rFonts w:eastAsia="Consolas"/>
+          <w:sz w:val="18"/>
+          <w:szCs w:val="18"/>
+        </w:rPr>
+        <w:t>;</w:t>
+      </w:r>
+      <w:r>
+        <w:br/>
+      </w:r>
+      <w:r>
+        <w:br/>
+      </w:r>
+      <w:r>
+        <w:rPr>
+          <w:rFonts w:eastAsia="Consolas"/>
+          <w:sz w:val="18"/>
+          <w:szCs w:val="18"/>
+        </w:rPr>
+        <w:t xml:space="preserve">    await _</w:t>
+      </w:r>
+      <w:proofErr w:type="spellStart"/>
+      <w:r>
+        <w:rPr>
+          <w:rFonts w:eastAsia="Consolas"/>
+          <w:sz w:val="18"/>
+          <w:szCs w:val="18"/>
+        </w:rPr>
+        <w:t>unitOfWork.Repository</w:t>
+      </w:r>
+      <w:proofErr w:type="spellEnd"/>
+      <w:r>
+        <w:rPr>
+          <w:rFonts w:eastAsia="Consolas"/>
+          <w:sz w:val="18"/>
+          <w:szCs w:val="18"/>
+        </w:rPr>
+        <w:t>&lt;</w:t>
+      </w:r>
+      <w:proofErr w:type="spellStart"/>
+      <w:r>
+        <w:rPr>
+          <w:rFonts w:eastAsia="Consolas"/>
+          <w:sz w:val="18"/>
+          <w:szCs w:val="18"/>
+        </w:rPr>
+        <w:t>ProjectTask</w:t>
+      </w:r>
+      <w:proofErr w:type="spellEnd"/>
+      <w:r>
+        <w:rPr>
+          <w:rFonts w:eastAsia="Consolas"/>
+          <w:sz w:val="18"/>
+          <w:szCs w:val="18"/>
+        </w:rPr>
+        <w:t>&gt;().</w:t>
+      </w:r>
+      <w:proofErr w:type="spellStart"/>
+      <w:r>
+        <w:rPr>
+          <w:rFonts w:eastAsia="Consolas"/>
+          <w:sz w:val="18"/>
+          <w:szCs w:val="18"/>
+        </w:rPr>
+        <w:t>AddAsync</w:t>
+      </w:r>
+      <w:proofErr w:type="spellEnd"/>
+      <w:r>
+        <w:rPr>
+          <w:rFonts w:eastAsia="Consolas"/>
+          <w:sz w:val="18"/>
+          <w:szCs w:val="18"/>
+        </w:rPr>
+        <w:t>(task);</w:t>
+      </w:r>
+      <w:r>
+        <w:br/>
+      </w:r>
+      <w:r>
+        <w:rPr>
+          <w:rFonts w:eastAsia="Consolas"/>
+          <w:sz w:val="18"/>
+          <w:szCs w:val="18"/>
+        </w:rPr>
+        <w:t xml:space="preserve">    await _</w:t>
+      </w:r>
+      <w:proofErr w:type="spellStart"/>
+      <w:r>
+        <w:rPr>
+          <w:rFonts w:eastAsia="Consolas"/>
+          <w:sz w:val="18"/>
+          <w:szCs w:val="18"/>
+        </w:rPr>
+        <w:t>unitOfWork.SaveChangesAsync</w:t>
+      </w:r>
+      <w:proofErr w:type="spellEnd"/>
+      <w:r>
+        <w:rPr>
+          <w:rFonts w:eastAsia="Consolas"/>
+          <w:sz w:val="18"/>
+          <w:szCs w:val="18"/>
+        </w:rPr>
+        <w:t>();</w:t>
+      </w:r>
+      <w:r>
+        <w:br/>
+      </w:r>
+      <w:r>
+        <w:br/>
+      </w:r>
+      <w:r>
+        <w:rPr>
+          <w:rFonts w:eastAsia="Consolas"/>
+          <w:sz w:val="18"/>
+          <w:szCs w:val="18"/>
+        </w:rPr>
+        <w:t xml:space="preserve">    foreach (var </w:t>
+      </w:r>
+      <w:proofErr w:type="spellStart"/>
+      <w:r>
+        <w:rPr>
+          <w:rFonts w:eastAsia="Consolas"/>
+          <w:sz w:val="18"/>
+          <w:szCs w:val="18"/>
+        </w:rPr>
+        <w:t>assigneeId</w:t>
+      </w:r>
+      <w:proofErr w:type="spellEnd"/>
+      <w:r>
+        <w:rPr>
+          <w:rFonts w:eastAsia="Consolas"/>
+          <w:sz w:val="18"/>
+          <w:szCs w:val="18"/>
+        </w:rPr>
+        <w:t xml:space="preserve"> in </w:t>
+      </w:r>
+      <w:proofErr w:type="spellStart"/>
+      <w:r>
+        <w:rPr>
+          <w:rFonts w:eastAsia="Consolas"/>
+          <w:sz w:val="18"/>
+          <w:szCs w:val="18"/>
+        </w:rPr>
+        <w:t>dto.AssigneeIds</w:t>
+      </w:r>
+      <w:proofErr w:type="spellEnd"/>
+      <w:r>
+        <w:rPr>
+          <w:rFonts w:eastAsia="Consolas"/>
+          <w:sz w:val="18"/>
+          <w:szCs w:val="18"/>
+        </w:rPr>
+        <w:t>)</w:t>
+      </w:r>
+      <w:r>
+        <w:br/>
+      </w:r>
+      <w:r>
+        <w:rPr>
+          <w:rFonts w:eastAsia="Consolas"/>
+          <w:sz w:val="18"/>
+          <w:szCs w:val="18"/>
+        </w:rPr>
+        <w:t xml:space="preserve">    {</w:t>
+      </w:r>
+      <w:r>
+        <w:br/>
+      </w:r>
+      <w:r>
+        <w:rPr>
+          <w:rFonts w:eastAsia="Consolas"/>
+          <w:sz w:val="18"/>
+          <w:szCs w:val="18"/>
+        </w:rPr>
+        <w:t xml:space="preserve">        await _</w:t>
+      </w:r>
+      <w:proofErr w:type="spellStart"/>
+      <w:r>
+        <w:rPr>
+          <w:rFonts w:eastAsia="Consolas"/>
+          <w:sz w:val="18"/>
+          <w:szCs w:val="18"/>
+        </w:rPr>
+        <w:t>unitOfWork.Repository</w:t>
+      </w:r>
+      <w:proofErr w:type="spellEnd"/>
+      <w:r>
+        <w:rPr>
+          <w:rFonts w:eastAsia="Consolas"/>
+          <w:sz w:val="18"/>
+          <w:szCs w:val="18"/>
+        </w:rPr>
+        <w:t>&lt;</w:t>
+      </w:r>
+      <w:proofErr w:type="spellStart"/>
+      <w:r>
+        <w:rPr>
+          <w:rFonts w:eastAsia="Consolas"/>
+          <w:sz w:val="18"/>
+          <w:szCs w:val="18"/>
+        </w:rPr>
+        <w:t>TaskAssignee</w:t>
+      </w:r>
+      <w:proofErr w:type="spellEnd"/>
+      <w:r>
+        <w:rPr>
+          <w:rFonts w:eastAsia="Consolas"/>
+          <w:sz w:val="18"/>
+          <w:szCs w:val="18"/>
+        </w:rPr>
+        <w:t>&gt;().</w:t>
+      </w:r>
+      <w:proofErr w:type="spellStart"/>
+      <w:r>
+        <w:rPr>
+          <w:rFonts w:eastAsia="Consolas"/>
+          <w:sz w:val="18"/>
+          <w:szCs w:val="18"/>
+        </w:rPr>
+        <w:t>AddAsync</w:t>
+      </w:r>
+      <w:proofErr w:type="spellEnd"/>
+      <w:r>
+        <w:rPr>
+          <w:rFonts w:eastAsia="Consolas"/>
+          <w:sz w:val="18"/>
+          <w:szCs w:val="18"/>
+        </w:rPr>
+        <w:t>(</w:t>
+      </w:r>
+      <w:r>
+        <w:br/>
+      </w:r>
+      <w:r>
+        <w:rPr>
+          <w:rFonts w:eastAsia="Consolas"/>
+          <w:sz w:val="18"/>
+          <w:szCs w:val="18"/>
+        </w:rPr>
+        <w:t xml:space="preserve">            new </w:t>
+      </w:r>
+      <w:proofErr w:type="spellStart"/>
+      <w:r>
+        <w:rPr>
+          <w:rFonts w:eastAsia="Consolas"/>
+          <w:sz w:val="18"/>
+          <w:szCs w:val="18"/>
+        </w:rPr>
+        <w:t>TaskAssignee</w:t>
+      </w:r>
+      <w:proofErr w:type="spellEnd"/>
+      <w:r>
+        <w:rPr>
+          <w:rFonts w:eastAsia="Consolas"/>
+          <w:sz w:val="18"/>
+          <w:szCs w:val="18"/>
+        </w:rPr>
+        <w:t xml:space="preserve"> { </w:t>
+      </w:r>
+      <w:proofErr w:type="spellStart"/>
+      <w:r>
+        <w:rPr>
+          <w:rFonts w:eastAsia="Consolas"/>
+          <w:sz w:val="18"/>
+          <w:szCs w:val="18"/>
+        </w:rPr>
+        <w:t>TaskId</w:t>
+      </w:r>
+      <w:proofErr w:type="spellEnd"/>
+      <w:r>
+        <w:rPr>
+          <w:rFonts w:eastAsia="Consolas"/>
+          <w:sz w:val="18"/>
+          <w:szCs w:val="18"/>
+        </w:rPr>
+        <w:t xml:space="preserve"> = </w:t>
+      </w:r>
+      <w:proofErr w:type="spellStart"/>
+      <w:r>
+        <w:rPr>
+          <w:rFonts w:eastAsia="Consolas"/>
+          <w:sz w:val="18"/>
+          <w:szCs w:val="18"/>
+        </w:rPr>
+        <w:t>task.Id</w:t>
+      </w:r>
+      <w:proofErr w:type="spellEnd"/>
+      <w:r>
+        <w:rPr>
+          <w:rFonts w:eastAsia="Consolas"/>
+          <w:sz w:val="18"/>
+          <w:szCs w:val="18"/>
+        </w:rPr>
+        <w:t xml:space="preserve">, </w:t>
+      </w:r>
+      <w:proofErr w:type="spellStart"/>
+      <w:r>
+        <w:rPr>
+          <w:rFonts w:eastAsia="Consolas"/>
+          <w:sz w:val="18"/>
+          <w:szCs w:val="18"/>
+        </w:rPr>
+        <w:t>UserId</w:t>
+      </w:r>
+      <w:proofErr w:type="spellEnd"/>
+      <w:r>
+        <w:rPr>
+          <w:rFonts w:eastAsia="Consolas"/>
+          <w:sz w:val="18"/>
+          <w:szCs w:val="18"/>
+        </w:rPr>
+        <w:t xml:space="preserve"> = </w:t>
+      </w:r>
+      <w:proofErr w:type="spellStart"/>
+      <w:r>
+        <w:rPr>
+          <w:rFonts w:eastAsia="Consolas"/>
+          <w:sz w:val="18"/>
+          <w:szCs w:val="18"/>
+        </w:rPr>
+        <w:t>assigneeId</w:t>
+      </w:r>
+      <w:proofErr w:type="spellEnd"/>
+      <w:r>
+        <w:rPr>
+          <w:rFonts w:eastAsia="Consolas"/>
+          <w:sz w:val="18"/>
+          <w:szCs w:val="18"/>
+        </w:rPr>
+        <w:t xml:space="preserve">, </w:t>
+      </w:r>
+      <w:proofErr w:type="spellStart"/>
+      <w:r>
+        <w:rPr>
+          <w:rFonts w:eastAsia="Consolas"/>
+          <w:sz w:val="18"/>
+          <w:szCs w:val="18"/>
+        </w:rPr>
+        <w:t>CreatedBy</w:t>
+      </w:r>
+      <w:proofErr w:type="spellEnd"/>
+      <w:r>
+        <w:rPr>
+          <w:rFonts w:eastAsia="Consolas"/>
+          <w:sz w:val="18"/>
+          <w:szCs w:val="18"/>
+        </w:rPr>
+        <w:t xml:space="preserve"> = </w:t>
+      </w:r>
+      <w:proofErr w:type="spellStart"/>
+      <w:r>
+        <w:rPr>
+          <w:rFonts w:eastAsia="Consolas"/>
+          <w:sz w:val="18"/>
+          <w:szCs w:val="18"/>
+        </w:rPr>
+        <w:t>userId</w:t>
+      </w:r>
+      <w:proofErr w:type="spellEnd"/>
+      <w:r>
+        <w:rPr>
+          <w:rFonts w:eastAsia="Consolas"/>
+          <w:sz w:val="18"/>
+          <w:szCs w:val="18"/>
+        </w:rPr>
+        <w:t xml:space="preserve"> });</w:t>
+      </w:r>
+      <w:r>
+        <w:br/>
+      </w:r>
+      <w:r>
+        <w:rPr>
+          <w:rFonts w:eastAsia="Consolas"/>
+          <w:sz w:val="18"/>
+          <w:szCs w:val="18"/>
+        </w:rPr>
+        <w:t xml:space="preserve">        await _</w:t>
+      </w:r>
+      <w:proofErr w:type="spellStart"/>
+      <w:r>
+        <w:rPr>
+          <w:rFonts w:eastAsia="Consolas"/>
+          <w:sz w:val="18"/>
+          <w:szCs w:val="18"/>
+        </w:rPr>
+        <w:t>notificationService.CreateNotificationAsync</w:t>
+      </w:r>
+      <w:proofErr w:type="spellEnd"/>
+      <w:r>
+        <w:rPr>
+          <w:rFonts w:eastAsia="Consolas"/>
+          <w:sz w:val="18"/>
+          <w:szCs w:val="18"/>
+        </w:rPr>
+        <w:t>(</w:t>
+      </w:r>
+      <w:r>
+        <w:br/>
+      </w:r>
+      <w:r>
+        <w:rPr>
+          <w:rFonts w:eastAsia="Consolas"/>
+          <w:sz w:val="18"/>
+          <w:szCs w:val="18"/>
+        </w:rPr>
+        <w:t xml:space="preserve">            </w:t>
+      </w:r>
+      <w:proofErr w:type="spellStart"/>
+      <w:r>
+        <w:rPr>
+          <w:rFonts w:eastAsia="Consolas"/>
+          <w:sz w:val="18"/>
+          <w:szCs w:val="18"/>
+        </w:rPr>
+        <w:t>assigneeId</w:t>
+      </w:r>
+      <w:proofErr w:type="spellEnd"/>
+      <w:r>
+        <w:rPr>
+          <w:rFonts w:eastAsia="Consolas"/>
+          <w:sz w:val="18"/>
+          <w:szCs w:val="18"/>
+        </w:rPr>
+        <w:t>, "New Task Assigned", $"...{</w:t>
+      </w:r>
+      <w:proofErr w:type="spellStart"/>
+      <w:r>
+        <w:rPr>
+          <w:rFonts w:eastAsia="Consolas"/>
+          <w:sz w:val="18"/>
+          <w:szCs w:val="18"/>
+        </w:rPr>
+        <w:t>task.Title</w:t>
+      </w:r>
+      <w:proofErr w:type="spellEnd"/>
+      <w:r>
+        <w:rPr>
+          <w:rFonts w:eastAsia="Consolas"/>
+          <w:sz w:val="18"/>
+          <w:szCs w:val="18"/>
+        </w:rPr>
+        <w:t xml:space="preserve">}", </w:t>
+      </w:r>
+      <w:proofErr w:type="spellStart"/>
+      <w:r>
+        <w:rPr>
+          <w:rFonts w:eastAsia="Consolas"/>
+          <w:sz w:val="18"/>
+          <w:szCs w:val="18"/>
+        </w:rPr>
+        <w:t>NotificationType.TaskAssigned</w:t>
+      </w:r>
+      <w:proofErr w:type="spellEnd"/>
+      <w:r>
+        <w:rPr>
+          <w:rFonts w:eastAsia="Consolas"/>
+          <w:sz w:val="18"/>
+          <w:szCs w:val="18"/>
+        </w:rPr>
+        <w:t>);</w:t>
+      </w:r>
+      <w:r>
+        <w:br/>
+      </w:r>
+      <w:r>
+        <w:rPr>
+          <w:rFonts w:eastAsia="Consolas"/>
+          <w:sz w:val="18"/>
+          <w:szCs w:val="18"/>
+        </w:rPr>
+        <w:t xml:space="preserve">    }</w:t>
+      </w:r>
+      <w:r>
+        <w:br/>
+      </w:r>
+      <w:r>
+        <w:rPr>
+          <w:rFonts w:eastAsia="Consolas"/>
+          <w:sz w:val="18"/>
+          <w:szCs w:val="18"/>
+        </w:rPr>
+        <w:t xml:space="preserve">    return </w:t>
+      </w:r>
+      <w:proofErr w:type="spellStart"/>
+      <w:r>
+        <w:rPr>
+          <w:rFonts w:eastAsia="Consolas"/>
+          <w:sz w:val="18"/>
+          <w:szCs w:val="18"/>
+        </w:rPr>
+        <w:t>ApiResponse</w:t>
+      </w:r>
+      <w:proofErr w:type="spellEnd"/>
+      <w:r>
+        <w:rPr>
+          <w:rFonts w:eastAsia="Consolas"/>
+          <w:sz w:val="18"/>
+          <w:szCs w:val="18"/>
+        </w:rPr>
+        <w:t>&lt;</w:t>
+      </w:r>
+      <w:proofErr w:type="spellStart"/>
+      <w:r>
+        <w:rPr>
+          <w:rFonts w:eastAsia="Consolas"/>
+          <w:sz w:val="18"/>
+          <w:szCs w:val="18"/>
+        </w:rPr>
+        <w:t>TaskDto</w:t>
+      </w:r>
+      <w:proofErr w:type="spellEnd"/>
+      <w:r>
+        <w:rPr>
+          <w:rFonts w:eastAsia="Consolas"/>
+          <w:sz w:val="18"/>
+          <w:szCs w:val="18"/>
+        </w:rPr>
+        <w:t xml:space="preserve">&gt;.Created(await </w:t>
+      </w:r>
+      <w:proofErr w:type="spellStart"/>
+      <w:r>
+        <w:rPr>
+          <w:rFonts w:eastAsia="Consolas"/>
+          <w:sz w:val="18"/>
+          <w:szCs w:val="18"/>
+        </w:rPr>
+        <w:t>EnrichAsync</w:t>
+      </w:r>
+      <w:proofErr w:type="spellEnd"/>
+      <w:r>
+        <w:rPr>
+          <w:rFonts w:eastAsia="Consolas"/>
+          <w:sz w:val="18"/>
+          <w:szCs w:val="18"/>
+        </w:rPr>
+        <w:t>(_</w:t>
+      </w:r>
+      <w:proofErr w:type="spellStart"/>
+      <w:r>
+        <w:rPr>
+          <w:rFonts w:eastAsia="Consolas"/>
+          <w:sz w:val="18"/>
+          <w:szCs w:val="18"/>
+        </w:rPr>
+        <w:t>mapper.Map</w:t>
+      </w:r>
+      <w:proofErr w:type="spellEnd"/>
+      <w:r>
+        <w:rPr>
+          <w:rFonts w:eastAsia="Consolas"/>
+          <w:sz w:val="18"/>
+          <w:szCs w:val="18"/>
+        </w:rPr>
+        <w:t>&lt;</w:t>
+      </w:r>
+      <w:proofErr w:type="spellStart"/>
+      <w:r>
+        <w:rPr>
+          <w:rFonts w:eastAsia="Consolas"/>
+          <w:sz w:val="18"/>
+          <w:szCs w:val="18"/>
+        </w:rPr>
+        <w:t>TaskDto</w:t>
+      </w:r>
+      <w:proofErr w:type="spellEnd"/>
+      <w:r>
+        <w:rPr>
+          <w:rFonts w:eastAsia="Consolas"/>
+          <w:sz w:val="18"/>
+          <w:szCs w:val="18"/>
+        </w:rPr>
+        <w:t>&gt;(task), task));</w:t>
+      </w:r>
+      <w:r>
+        <w:br/>
+      </w:r>
+      <w:r>
+        <w:rPr>
+          <w:rFonts w:eastAsia="Consolas"/>
+          <w:sz w:val="18"/>
+          <w:szCs w:val="18"/>
+        </w:rPr>
         <w:t>}</w:t>
       </w:r>
     </w:p>
@@ -6184,7 +7975,39 @@
           <w:sz w:val="24"/>
           <w:szCs w:val="24"/>
         </w:rPr>
-        <w:t xml:space="preserve">On the frontend, Angular 20 standalone components (no NgModules) are organized by feature (features/auth, features/projects, features/tasks) with a core/ folder for cross-cutting services, models, guards, and an HTTP interceptor that attaches the JWT to every outgoing request automatically. Component state uses Angular's </w:t>
+        <w:t xml:space="preserve">On the frontend, Angular 20 standalone components (no </w:t>
+      </w:r>
+      <w:proofErr w:type="spellStart"/>
+      <w:r>
+        <w:rPr>
+          <w:sz w:val="24"/>
+          <w:szCs w:val="24"/>
+        </w:rPr>
+        <w:t>NgModules</w:t>
+      </w:r>
+      <w:proofErr w:type="spellEnd"/>
+      <w:r>
+        <w:rPr>
+          <w:sz w:val="24"/>
+          <w:szCs w:val="24"/>
+        </w:rPr>
+        <w:t xml:space="preserve">) are organized by feature (features/auth, features/projects, features/tasks) with a core/ folder for cross-cutting services, models, guards, and an HTTP interceptor that attaches the JWT to every outgoing request automatically. Component state uses </w:t>
+      </w:r>
+      <w:proofErr w:type="spellStart"/>
+      <w:r>
+        <w:rPr>
+          <w:sz w:val="24"/>
+          <w:szCs w:val="24"/>
+        </w:rPr>
+        <w:t>Angular's</w:t>
+      </w:r>
+      <w:proofErr w:type="spellEnd"/>
+      <w:r>
+        <w:rPr>
+          <w:sz w:val="24"/>
+          <w:szCs w:val="24"/>
+        </w:rPr>
+        <w:t xml:space="preserve"> </w:t>
       </w:r>
       <w:proofErr w:type="gramStart"/>
       <w:r>
@@ -6200,7 +8023,23 @@
           <w:sz w:val="24"/>
           <w:szCs w:val="24"/>
         </w:rPr>
-        <w:t>) API rather than manual change detection, and all authenticated routes are lazy-loaded (loadComponent) and nested under a single Shell layout component so navigation and notifications are consistent across every page.</w:t>
+        <w:t>) API rather than manual change detection, and all authenticated routes are lazy-loaded (</w:t>
+      </w:r>
+      <w:proofErr w:type="spellStart"/>
+      <w:r>
+        <w:rPr>
+          <w:sz w:val="24"/>
+          <w:szCs w:val="24"/>
+        </w:rPr>
+        <w:t>loadComponent</w:t>
+      </w:r>
+      <w:proofErr w:type="spellEnd"/>
+      <w:r>
+        <w:rPr>
+          <w:sz w:val="24"/>
+          <w:szCs w:val="24"/>
+        </w:rPr>
+        <w:t>) and nested under a single Shell layout component so navigation and notifications are consistent across every page.</w:t>
       </w:r>
     </w:p>
     <w:p>
@@ -6229,12 +8068,21 @@
         <w:spacing w:after="160" w:line="360" w:lineRule="auto"/>
         <w:jc w:val="both"/>
       </w:pPr>
-      <w:r>
-        <w:rPr>
-          <w:sz w:val="24"/>
-          <w:szCs w:val="24"/>
-        </w:rPr>
-        <w:t>NexusFlow was built to address a genuine gap in how small organizations and student teams manage projects — the fragmentation of task tracking, communication, and reporting across disconnected tools such as spreadsheets, chat applications, and email. Across the training period, the system was developed incrementally: a Clean Architecture ASP.NET Core (.NET 10) backend with eight functional modules, secured by JWT authentication and role-based authorization, paired with an Angular 20 frontend built on standalone components and signal-based state. Every core workflow — registration and login, project creation and editing, task creation with multi-assignee support and status tracking, task-level comments, and event-driven notifications — was verified end-to-end against a live SQL Server database rather than left as an untested design on paper.</w:t>
+      <w:proofErr w:type="spellStart"/>
+      <w:r>
+        <w:rPr>
+          <w:sz w:val="24"/>
+          <w:szCs w:val="24"/>
+        </w:rPr>
+        <w:t>NexusFlow</w:t>
+      </w:r>
+      <w:proofErr w:type="spellEnd"/>
+      <w:r>
+        <w:rPr>
+          <w:sz w:val="24"/>
+          <w:szCs w:val="24"/>
+        </w:rPr>
+        <w:t xml:space="preserve"> was built to address a genuine gap in how small organizations and student teams manage projects — the fragmentation of task tracking, communication, and reporting across disconnected tools such as spreadsheets, chat applications, and email. Across the training period, the system was developed incrementally: a Clean Architecture ASP.NET Core (.NET 10) backend with eight functional modules, secured by JWT authentication and role-based authorization, paired with an Angular 20 frontend built on standalone components and signal-based state. Every core workflow — registration and login, project creation and editing, task creation with multi-assignee support and status tracking, task-level comments, and event-driven notifications — was verified end-to-end against a live SQL Server database rather than left as an untested design on paper.</w:t>
       </w:r>
     </w:p>
     <w:p>
@@ -6339,7 +8187,23 @@
           <w:sz w:val="24"/>
           <w:szCs w:val="24"/>
         </w:rPr>
-        <w:t>The Calendar &amp; Meetings and Admin Panel modules described in the original project scope were de-prioritized in favor of completing the core Project/Task/Comment/Notification workflow within the training timeline.</w:t>
+        <w:t xml:space="preserve">The Calendar &amp; Meetings and Admin Panel modules described in the original project scope were de-prioritized in </w:t>
+      </w:r>
+      <w:proofErr w:type="spellStart"/>
+      <w:r>
+        <w:rPr>
+          <w:sz w:val="24"/>
+          <w:szCs w:val="24"/>
+        </w:rPr>
+        <w:t>favor</w:t>
+      </w:r>
+      <w:proofErr w:type="spellEnd"/>
+      <w:r>
+        <w:rPr>
+          <w:sz w:val="24"/>
+          <w:szCs w:val="24"/>
+        </w:rPr>
+        <w:t xml:space="preserve"> of completing the core Project/Task/Comment/Notification workflow within the training timeline.</w:t>
       </w:r>
     </w:p>
     <w:p>
@@ -6394,7 +8258,23 @@
           <w:sz w:val="24"/>
           <w:szCs w:val="24"/>
         </w:rPr>
-        <w:t>Real-time notifications and live updates using SignalR, replacing the current polling mechanism with instant push delivery.</w:t>
+        <w:t xml:space="preserve">Real-time notifications and live updates using </w:t>
+      </w:r>
+      <w:proofErr w:type="spellStart"/>
+      <w:r>
+        <w:rPr>
+          <w:sz w:val="24"/>
+          <w:szCs w:val="24"/>
+        </w:rPr>
+        <w:t>SignalR</w:t>
+      </w:r>
+      <w:proofErr w:type="spellEnd"/>
+      <w:r>
+        <w:rPr>
+          <w:sz w:val="24"/>
+          <w:szCs w:val="24"/>
+        </w:rPr>
+        <w:t>, replacing the current polling mechanism with instant push delivery.</w:t>
       </w:r>
     </w:p>
     <w:p>
@@ -6505,7 +8385,23 @@
           <w:sz w:val="24"/>
           <w:szCs w:val="24"/>
         </w:rPr>
-        <w:t>Automated testing (xUnit for the backend, Jasmine/Karma for the frontend) to replace the current manual verification workflow.</w:t>
+        <w:t>Automated testing (</w:t>
+      </w:r>
+      <w:proofErr w:type="spellStart"/>
+      <w:r>
+        <w:rPr>
+          <w:sz w:val="24"/>
+          <w:szCs w:val="24"/>
+        </w:rPr>
+        <w:t>xUnit</w:t>
+      </w:r>
+      <w:proofErr w:type="spellEnd"/>
+      <w:r>
+        <w:rPr>
+          <w:sz w:val="24"/>
+          <w:szCs w:val="24"/>
+        </w:rPr>
+        <w:t xml:space="preserve"> for the backend, Jasmine/Karma for the frontend) to replace the current manual verification workflow.</w:t>
       </w:r>
     </w:p>
     <w:p>
@@ -6643,12 +8539,21 @@
       </w:tabs>
       <w:spacing w:after="120"/>
     </w:pPr>
+    <w:proofErr w:type="spellStart"/>
     <w:r>
       <w:rPr>
         <w:sz w:val="18"/>
         <w:szCs w:val="18"/>
       </w:rPr>
-      <w:t>NexusFlow – Project Report</w:t>
+      <w:t>NexusFlow</w:t>
+    </w:r>
+    <w:proofErr w:type="spellEnd"/>
+    <w:r>
+      <w:rPr>
+        <w:sz w:val="18"/>
+        <w:szCs w:val="18"/>
+      </w:rPr>
+      <w:t xml:space="preserve"> – Project Report</w:t>
     </w:r>
     <w:r>
       <w:rPr>
@@ -6836,6 +8741,232 @@
       </w:pPr>
     </w:lvl>
   </w:abstractNum>
+  <w:abstractNum w:abstractNumId="2" w15:restartNumberingAfterBreak="0">
+    <w:nsid w:val="602B2F20"/>
+    <w:multiLevelType w:val="hybridMultilevel"/>
+    <w:tmpl w:val="30FC7A74"/>
+    <w:lvl w:ilvl="0" w:tplc="40090001">
+      <w:start w:val="1"/>
+      <w:numFmt w:val="bullet"/>
+      <w:lvlText w:val=""/>
+      <w:lvlJc w:val="left"/>
+      <w:pPr>
+        <w:ind w:left="720" w:hanging="360"/>
+      </w:pPr>
+      <w:rPr>
+        <w:rFonts w:ascii="Symbol" w:hAnsi="Symbol" w:hint="default"/>
+      </w:rPr>
+    </w:lvl>
+    <w:lvl w:ilvl="1" w:tplc="40090003" w:tentative="1">
+      <w:start w:val="1"/>
+      <w:numFmt w:val="bullet"/>
+      <w:lvlText w:val="o"/>
+      <w:lvlJc w:val="left"/>
+      <w:pPr>
+        <w:ind w:left="1440" w:hanging="360"/>
+      </w:pPr>
+      <w:rPr>
+        <w:rFonts w:ascii="Courier New" w:hAnsi="Courier New" w:cs="Courier New" w:hint="default"/>
+      </w:rPr>
+    </w:lvl>
+    <w:lvl w:ilvl="2" w:tplc="40090005" w:tentative="1">
+      <w:start w:val="1"/>
+      <w:numFmt w:val="bullet"/>
+      <w:lvlText w:val=""/>
+      <w:lvlJc w:val="left"/>
+      <w:pPr>
+        <w:ind w:left="2160" w:hanging="360"/>
+      </w:pPr>
+      <w:rPr>
+        <w:rFonts w:ascii="Wingdings" w:hAnsi="Wingdings" w:hint="default"/>
+      </w:rPr>
+    </w:lvl>
+    <w:lvl w:ilvl="3" w:tplc="40090001" w:tentative="1">
+      <w:start w:val="1"/>
+      <w:numFmt w:val="bullet"/>
+      <w:lvlText w:val=""/>
+      <w:lvlJc w:val="left"/>
+      <w:pPr>
+        <w:ind w:left="2880" w:hanging="360"/>
+      </w:pPr>
+      <w:rPr>
+        <w:rFonts w:ascii="Symbol" w:hAnsi="Symbol" w:hint="default"/>
+      </w:rPr>
+    </w:lvl>
+    <w:lvl w:ilvl="4" w:tplc="40090003" w:tentative="1">
+      <w:start w:val="1"/>
+      <w:numFmt w:val="bullet"/>
+      <w:lvlText w:val="o"/>
+      <w:lvlJc w:val="left"/>
+      <w:pPr>
+        <w:ind w:left="3600" w:hanging="360"/>
+      </w:pPr>
+      <w:rPr>
+        <w:rFonts w:ascii="Courier New" w:hAnsi="Courier New" w:cs="Courier New" w:hint="default"/>
+      </w:rPr>
+    </w:lvl>
+    <w:lvl w:ilvl="5" w:tplc="40090005" w:tentative="1">
+      <w:start w:val="1"/>
+      <w:numFmt w:val="bullet"/>
+      <w:lvlText w:val=""/>
+      <w:lvlJc w:val="left"/>
+      <w:pPr>
+        <w:ind w:left="4320" w:hanging="360"/>
+      </w:pPr>
+      <w:rPr>
+        <w:rFonts w:ascii="Wingdings" w:hAnsi="Wingdings" w:hint="default"/>
+      </w:rPr>
+    </w:lvl>
+    <w:lvl w:ilvl="6" w:tplc="40090001" w:tentative="1">
+      <w:start w:val="1"/>
+      <w:numFmt w:val="bullet"/>
+      <w:lvlText w:val=""/>
+      <w:lvlJc w:val="left"/>
+      <w:pPr>
+        <w:ind w:left="5040" w:hanging="360"/>
+      </w:pPr>
+      <w:rPr>
+        <w:rFonts w:ascii="Symbol" w:hAnsi="Symbol" w:hint="default"/>
+      </w:rPr>
+    </w:lvl>
+    <w:lvl w:ilvl="7" w:tplc="40090003" w:tentative="1">
+      <w:start w:val="1"/>
+      <w:numFmt w:val="bullet"/>
+      <w:lvlText w:val="o"/>
+      <w:lvlJc w:val="left"/>
+      <w:pPr>
+        <w:ind w:left="5760" w:hanging="360"/>
+      </w:pPr>
+      <w:rPr>
+        <w:rFonts w:ascii="Courier New" w:hAnsi="Courier New" w:cs="Courier New" w:hint="default"/>
+      </w:rPr>
+    </w:lvl>
+    <w:lvl w:ilvl="8" w:tplc="40090005" w:tentative="1">
+      <w:start w:val="1"/>
+      <w:numFmt w:val="bullet"/>
+      <w:lvlText w:val=""/>
+      <w:lvlJc w:val="left"/>
+      <w:pPr>
+        <w:ind w:left="6480" w:hanging="360"/>
+      </w:pPr>
+      <w:rPr>
+        <w:rFonts w:ascii="Wingdings" w:hAnsi="Wingdings" w:hint="default"/>
+      </w:rPr>
+    </w:lvl>
+  </w:abstractNum>
+  <w:abstractNum w:abstractNumId="3" w15:restartNumberingAfterBreak="0">
+    <w:nsid w:val="6F6F38A9"/>
+    <w:multiLevelType w:val="hybridMultilevel"/>
+    <w:tmpl w:val="B32E601C"/>
+    <w:lvl w:ilvl="0" w:tplc="40090001">
+      <w:start w:val="1"/>
+      <w:numFmt w:val="bullet"/>
+      <w:lvlText w:val=""/>
+      <w:lvlJc w:val="left"/>
+      <w:pPr>
+        <w:ind w:left="720" w:hanging="360"/>
+      </w:pPr>
+      <w:rPr>
+        <w:rFonts w:ascii="Symbol" w:hAnsi="Symbol" w:hint="default"/>
+      </w:rPr>
+    </w:lvl>
+    <w:lvl w:ilvl="1" w:tplc="40090003" w:tentative="1">
+      <w:start w:val="1"/>
+      <w:numFmt w:val="bullet"/>
+      <w:lvlText w:val="o"/>
+      <w:lvlJc w:val="left"/>
+      <w:pPr>
+        <w:ind w:left="1440" w:hanging="360"/>
+      </w:pPr>
+      <w:rPr>
+        <w:rFonts w:ascii="Courier New" w:hAnsi="Courier New" w:cs="Courier New" w:hint="default"/>
+      </w:rPr>
+    </w:lvl>
+    <w:lvl w:ilvl="2" w:tplc="40090005" w:tentative="1">
+      <w:start w:val="1"/>
+      <w:numFmt w:val="bullet"/>
+      <w:lvlText w:val=""/>
+      <w:lvlJc w:val="left"/>
+      <w:pPr>
+        <w:ind w:left="2160" w:hanging="360"/>
+      </w:pPr>
+      <w:rPr>
+        <w:rFonts w:ascii="Wingdings" w:hAnsi="Wingdings" w:hint="default"/>
+      </w:rPr>
+    </w:lvl>
+    <w:lvl w:ilvl="3" w:tplc="40090001" w:tentative="1">
+      <w:start w:val="1"/>
+      <w:numFmt w:val="bullet"/>
+      <w:lvlText w:val=""/>
+      <w:lvlJc w:val="left"/>
+      <w:pPr>
+        <w:ind w:left="2880" w:hanging="360"/>
+      </w:pPr>
+      <w:rPr>
+        <w:rFonts w:ascii="Symbol" w:hAnsi="Symbol" w:hint="default"/>
+      </w:rPr>
+    </w:lvl>
+    <w:lvl w:ilvl="4" w:tplc="40090003" w:tentative="1">
+      <w:start w:val="1"/>
+      <w:numFmt w:val="bullet"/>
+      <w:lvlText w:val="o"/>
+      <w:lvlJc w:val="left"/>
+      <w:pPr>
+        <w:ind w:left="3600" w:hanging="360"/>
+      </w:pPr>
+      <w:rPr>
+        <w:rFonts w:ascii="Courier New" w:hAnsi="Courier New" w:cs="Courier New" w:hint="default"/>
+      </w:rPr>
+    </w:lvl>
+    <w:lvl w:ilvl="5" w:tplc="40090005" w:tentative="1">
+      <w:start w:val="1"/>
+      <w:numFmt w:val="bullet"/>
+      <w:lvlText w:val=""/>
+      <w:lvlJc w:val="left"/>
+      <w:pPr>
+        <w:ind w:left="4320" w:hanging="360"/>
+      </w:pPr>
+      <w:rPr>
+        <w:rFonts w:ascii="Wingdings" w:hAnsi="Wingdings" w:hint="default"/>
+      </w:rPr>
+    </w:lvl>
+    <w:lvl w:ilvl="6" w:tplc="40090001" w:tentative="1">
+      <w:start w:val="1"/>
+      <w:numFmt w:val="bullet"/>
+      <w:lvlText w:val=""/>
+      <w:lvlJc w:val="left"/>
+      <w:pPr>
+        <w:ind w:left="5040" w:hanging="360"/>
+      </w:pPr>
+      <w:rPr>
+        <w:rFonts w:ascii="Symbol" w:hAnsi="Symbol" w:hint="default"/>
+      </w:rPr>
+    </w:lvl>
+    <w:lvl w:ilvl="7" w:tplc="40090003" w:tentative="1">
+      <w:start w:val="1"/>
+      <w:numFmt w:val="bullet"/>
+      <w:lvlText w:val="o"/>
+      <w:lvlJc w:val="left"/>
+      <w:pPr>
+        <w:ind w:left="5760" w:hanging="360"/>
+      </w:pPr>
+      <w:rPr>
+        <w:rFonts w:ascii="Courier New" w:hAnsi="Courier New" w:cs="Courier New" w:hint="default"/>
+      </w:rPr>
+    </w:lvl>
+    <w:lvl w:ilvl="8" w:tplc="40090005" w:tentative="1">
+      <w:start w:val="1"/>
+      <w:numFmt w:val="bullet"/>
+      <w:lvlText w:val=""/>
+      <w:lvlJc w:val="left"/>
+      <w:pPr>
+        <w:ind w:left="6480" w:hanging="360"/>
+      </w:pPr>
+      <w:rPr>
+        <w:rFonts w:ascii="Wingdings" w:hAnsi="Wingdings" w:hint="default"/>
+      </w:rPr>
+    </w:lvl>
+  </w:abstractNum>
   <w:num w:numId="1" w16cid:durableId="1052576238">
     <w:abstractNumId w:val="0"/>
     <w:lvlOverride w:ilvl="0">
@@ -6847,6 +8978,12 @@
     <w:lvlOverride w:ilvl="0">
       <w:startOverride w:val="1"/>
     </w:lvlOverride>
+  </w:num>
+  <w:num w:numId="3" w16cid:durableId="48114586">
+    <w:abstractNumId w:val="3"/>
+  </w:num>
+  <w:num w:numId="4" w16cid:durableId="1795296462">
+    <w:abstractNumId w:val="2"/>
   </w:num>
 </w:numbering>
 </file>
@@ -7331,6 +9468,7 @@
   <w:style w:type="character" w:default="1" w:styleId="DefaultParagraphFont">
     <w:name w:val="Default Paragraph Font"/>
     <w:uiPriority w:val="1"/>
+    <w:semiHidden/>
     <w:unhideWhenUsed/>
   </w:style>
   <w:style w:type="table" w:default="1" w:styleId="TableNormal">

</xml_diff>